<commit_message>
Update resume contact details, adjust education card spacing, and correct degree title in Spanish dictionary.
- Removed hyperlink formatting from email and phone number in resume.
- Increased bottom margin for education card list items.
- Changed degree title from "Técnico Superior en Desarrollo de Software" to "Tecnólogo en Desarrollo de Software" in Spanish dictionary.
</commit_message>
<xml_diff>
--- a/public/resume.docx
+++ b/public/resume.docx
@@ -1434,11 +1434,66 @@
     </w:p>
     <w:p>
       <w:pPr>
-        <w:spacing w:before="240" w:after="0" w:line="276" w:lineRule="auto"/>
+        <w:spacing w:after="0" w:line="276" w:lineRule="auto"/>
         <w:ind w:left="288" w:right="-720"/>
         <w:rPr>
           <w:rStyle w:val="Hipervnculo"/>
           <w:rFonts w:ascii="Roboto" w:hAnsi="Roboto"/>
+          <w:color w:val="404040" w:themeColor="text1" w:themeTint="BF"/>
+          <w:sz w:val="16"/>
+          <w:szCs w:val="16"/>
+          <w:u w:val="none"/>
+          <w:lang w:val="en-US"/>
+        </w:rPr>
+      </w:pPr>
+      <w:r>
+        <w:rPr>
+          <w:rStyle w:val="Hipervnculo"/>
+          <w:rFonts w:ascii="Roboto" w:hAnsi="Roboto"/>
+          <w:color w:val="404040" w:themeColor="text1" w:themeTint="BF"/>
+          <w:sz w:val="16"/>
+          <w:szCs w:val="16"/>
+          <w:u w:val="none"/>
+          <w:lang w:val="en-US"/>
+        </w:rPr>
+        <w:t>fraineralex2001@gmail.com</w:t>
+      </w:r>
+    </w:p>
+    <w:p>
+      <w:pPr>
+        <w:spacing w:after="0" w:line="276" w:lineRule="auto"/>
+        <w:ind w:left="288" w:right="-720"/>
+        <w:rPr>
+          <w:rStyle w:val="Hipervnculo"/>
+          <w:rFonts w:ascii="Roboto" w:hAnsi="Roboto"/>
+          <w:color w:val="404040" w:themeColor="text1" w:themeTint="BF"/>
+          <w:sz w:val="16"/>
+          <w:szCs w:val="16"/>
+          <w:u w:val="none"/>
+          <w:lang w:val="en-US"/>
+        </w:rPr>
+      </w:pPr>
+      <w:r>
+        <w:rPr>
+          <w:rStyle w:val="Hipervnculo"/>
+          <w:rFonts w:ascii="Roboto" w:hAnsi="Roboto"/>
+          <w:color w:val="404040" w:themeColor="text1" w:themeTint="BF"/>
+          <w:sz w:val="16"/>
+          <w:szCs w:val="16"/>
+          <w:u w:val="none"/>
+          <w:lang w:val="en-US"/>
+        </w:rPr>
+        <w:t>(809) 454–1362</w:t>
+      </w:r>
+    </w:p>
+    <w:p>
+      <w:pPr>
+        <w:spacing w:after="0" w:line="276" w:lineRule="auto"/>
+        <w:ind w:left="288" w:right="-720"/>
+        <w:rPr>
+          <w:rStyle w:val="Hipervnculo"/>
+          <w:rFonts w:ascii="Roboto" w:hAnsi="Roboto"/>
+          <w:color w:val="000000" w:themeColor="text1"/>
           <w:sz w:val="16"/>
           <w:szCs w:val="16"/>
           <w:lang w:val="en-US"/>
@@ -1449,66 +1504,7 @@
           <w:rPr>
             <w:rStyle w:val="Hipervnculo"/>
             <w:rFonts w:ascii="Roboto" w:hAnsi="Roboto"/>
-            <w:sz w:val="16"/>
-            <w:szCs w:val="16"/>
-            <w:lang w:val="en-US"/>
-          </w:rPr>
-          <w:t>fraineralex2001@gmail.com</w:t>
-        </w:r>
-      </w:hyperlink>
-    </w:p>
-    <w:p>
-      <w:pPr>
-        <w:spacing w:after="0" w:line="276" w:lineRule="auto"/>
-        <w:ind w:left="288" w:right="-720"/>
-        <w:rPr>
-          <w:rStyle w:val="Hipervnculo"/>
-          <w:rFonts w:ascii="Roboto" w:hAnsi="Roboto"/>
-          <w:sz w:val="16"/>
-          <w:szCs w:val="16"/>
-          <w:lang w:val="en-US"/>
-        </w:rPr>
-      </w:pPr>
-      <w:hyperlink r:id="rId10" w:history="1">
-        <w:r>
-          <w:rPr>
-            <w:rStyle w:val="Hipervnculo"/>
-            <w:rFonts w:ascii="Roboto" w:hAnsi="Roboto"/>
-            <w:sz w:val="16"/>
-            <w:szCs w:val="16"/>
-            <w:lang w:val="en-US"/>
-          </w:rPr>
-          <w:t>(</w:t>
-        </w:r>
-        <w:r>
-          <w:rPr>
-            <w:rStyle w:val="Hipervnculo"/>
-            <w:rFonts w:ascii="Roboto" w:hAnsi="Roboto"/>
-            <w:sz w:val="16"/>
-            <w:szCs w:val="16"/>
-            <w:lang w:val="en-US"/>
-          </w:rPr>
-          <w:t>809) 454–1362</w:t>
-        </w:r>
-      </w:hyperlink>
-    </w:p>
-    <w:p>
-      <w:pPr>
-        <w:spacing w:after="0" w:line="276" w:lineRule="auto"/>
-        <w:ind w:left="288" w:right="-720"/>
-        <w:rPr>
-          <w:rStyle w:val="Hipervnculo"/>
-          <w:rFonts w:ascii="Roboto" w:hAnsi="Roboto"/>
-          <w:sz w:val="16"/>
-          <w:szCs w:val="16"/>
-          <w:lang w:val="en-US"/>
-        </w:rPr>
-      </w:pPr>
-      <w:hyperlink r:id="rId11" w:history="1">
-        <w:r>
-          <w:rPr>
-            <w:rStyle w:val="Hipervnculo"/>
-            <w:rFonts w:ascii="Roboto" w:hAnsi="Roboto"/>
+            <w:color w:val="000000" w:themeColor="text1"/>
             <w:sz w:val="16"/>
             <w:szCs w:val="16"/>
             <w:lang w:val="en-US"/>
@@ -1520,6 +1516,7 @@
           <w:rPr>
             <w:rStyle w:val="Hipervnculo"/>
             <w:rFonts w:ascii="Roboto" w:hAnsi="Roboto"/>
+            <w:color w:val="000000" w:themeColor="text1"/>
             <w:sz w:val="16"/>
             <w:szCs w:val="16"/>
             <w:lang w:val="en-US"/>
@@ -1536,16 +1533,18 @@
         <w:rPr>
           <w:rStyle w:val="Hipervnculo"/>
           <w:rFonts w:ascii="Roboto" w:hAnsi="Roboto"/>
-          <w:sz w:val="16"/>
-          <w:szCs w:val="16"/>
-          <w:lang w:val="en-US"/>
-        </w:rPr>
-      </w:pPr>
-      <w:hyperlink r:id="rId12" w:history="1">
+          <w:color w:val="000000" w:themeColor="text1"/>
+          <w:sz w:val="16"/>
+          <w:szCs w:val="16"/>
+          <w:lang w:val="en-US"/>
+        </w:rPr>
+      </w:pPr>
+      <w:hyperlink r:id="rId10" w:history="1">
         <w:r>
           <w:rPr>
             <w:rStyle w:val="Hipervnculo"/>
             <w:rFonts w:ascii="Roboto" w:hAnsi="Roboto"/>
+            <w:color w:val="000000" w:themeColor="text1"/>
             <w:sz w:val="16"/>
             <w:szCs w:val="16"/>
             <w:lang w:val="en-US"/>
@@ -1560,17 +1559,19 @@
         <w:ind w:left="288" w:right="-720"/>
         <w:rPr>
           <w:rFonts w:ascii="Roboto" w:hAnsi="Roboto"/>
-          <w:sz w:val="16"/>
-          <w:szCs w:val="16"/>
-          <w:lang w:val="en-US"/>
-        </w:rPr>
-      </w:pPr>
-      <w:hyperlink r:id="rId13" w:history="1">
+          <w:color w:val="000000" w:themeColor="text1"/>
+          <w:sz w:val="16"/>
+          <w:szCs w:val="16"/>
+          <w:lang w:val="en-US"/>
+        </w:rPr>
+      </w:pPr>
+      <w:hyperlink r:id="rId11" w:history="1">
         <w:proofErr w:type="spellStart"/>
         <w:r>
           <w:rPr>
             <w:rStyle w:val="Hipervnculo"/>
             <w:rFonts w:ascii="Roboto" w:hAnsi="Roboto"/>
+            <w:color w:val="000000" w:themeColor="text1"/>
             <w:sz w:val="16"/>
             <w:szCs w:val="16"/>
             <w:lang w:val="en-US"/>
@@ -2115,12 +2116,13 @@
         </w:rPr>
         <w:t xml:space="preserve"> | </w:t>
       </w:r>
-      <w:hyperlink r:id="rId14" w:history="1">
+      <w:hyperlink r:id="rId12" w:history="1">
         <w:proofErr w:type="spellStart"/>
         <w:r>
           <w:rPr>
             <w:rStyle w:val="Hipervnculo"/>
             <w:rFonts w:ascii="Roboto" w:hAnsi="Roboto"/>
+            <w:color w:val="000000" w:themeColor="text1"/>
             <w:sz w:val="18"/>
             <w:szCs w:val="18"/>
             <w:lang w:val="en-US"/>
@@ -2275,12 +2277,13 @@
         </w:rPr>
         <w:t xml:space="preserve"> | </w:t>
       </w:r>
-      <w:hyperlink r:id="rId15" w:history="1">
+      <w:hyperlink r:id="rId13" w:history="1">
         <w:proofErr w:type="spellStart"/>
         <w:r>
           <w:rPr>
             <w:rStyle w:val="Hipervnculo"/>
             <w:rFonts w:ascii="Roboto" w:hAnsi="Roboto"/>
+            <w:color w:val="000000" w:themeColor="text1"/>
             <w:sz w:val="18"/>
             <w:szCs w:val="18"/>
             <w:lang w:val="en-US"/>
@@ -2408,6 +2411,7 @@
         <w:ind w:left="288" w:right="-720"/>
         <w:rPr>
           <w:rFonts w:ascii="Roboto" w:hAnsi="Roboto"/>
+          <w:color w:val="404040" w:themeColor="text1" w:themeTint="BF"/>
           <w:sz w:val="18"/>
           <w:szCs w:val="18"/>
           <w:lang w:val="en-US"/>
@@ -2435,25 +2439,39 @@
           <w:szCs w:val="18"/>
           <w:lang w:val="en-US"/>
         </w:rPr>
-        <w:t xml:space="preserve"> |</w:t>
-      </w:r>
-      <w:r>
-        <w:rPr>
-          <w:rFonts w:ascii="Roboto" w:hAnsi="Roboto"/>
-          <w:b/>
-          <w:bCs/>
-          <w:sz w:val="18"/>
-          <w:szCs w:val="18"/>
-          <w:lang w:val="en-US"/>
-        </w:rPr>
         <w:t xml:space="preserve"> </w:t>
       </w:r>
-      <w:hyperlink r:id="rId16" w:history="1">
+      <w:r>
+        <w:rPr>
+          <w:rFonts w:ascii="Roboto" w:hAnsi="Roboto"/>
+          <w:b/>
+          <w:bCs/>
+          <w:color w:val="404040" w:themeColor="text1" w:themeTint="BF"/>
+          <w:sz w:val="18"/>
+          <w:szCs w:val="18"/>
+          <w:lang w:val="en-US"/>
+        </w:rPr>
+        <w:t>|</w:t>
+      </w:r>
+      <w:r>
+        <w:rPr>
+          <w:rFonts w:ascii="Roboto" w:hAnsi="Roboto"/>
+          <w:b/>
+          <w:bCs/>
+          <w:color w:val="404040" w:themeColor="text1" w:themeTint="BF"/>
+          <w:sz w:val="18"/>
+          <w:szCs w:val="18"/>
+          <w:lang w:val="en-US"/>
+        </w:rPr>
+        <w:t xml:space="preserve"> </w:t>
+      </w:r>
+      <w:hyperlink r:id="rId14" w:history="1">
         <w:proofErr w:type="spellStart"/>
         <w:r>
           <w:rPr>
             <w:rStyle w:val="Hipervnculo"/>
             <w:rFonts w:ascii="Roboto" w:hAnsi="Roboto"/>
+            <w:color w:val="000000" w:themeColor="text1"/>
             <w:sz w:val="18"/>
             <w:szCs w:val="18"/>
             <w:lang w:val="en-US"/>

</xml_diff>

<commit_message>
Update resume content and improve tagline in English and Spanish dictionaries.
- Revised job descriptions to reflect past achievements and impact.
- Enhanced tagline to better represent skills and expertise in both languages.
</commit_message>
<xml_diff>
--- a/public/resume.docx
+++ b/public/resume.docx
@@ -277,27 +277,19 @@
           <w:szCs w:val="18"/>
           <w:lang w:val="en-US"/>
         </w:rPr>
-        <w:t>Deliver full</w:t>
-      </w:r>
-      <w:r>
-        <w:rPr>
-          <w:rFonts w:ascii="Roboto" w:hAnsi="Roboto"/>
-          <w:color w:val="262626" w:themeColor="text1" w:themeTint="D9"/>
-          <w:sz w:val="18"/>
-          <w:szCs w:val="18"/>
-          <w:lang w:val="en-US"/>
-        </w:rPr>
-        <w:t xml:space="preserve"> </w:t>
-      </w:r>
-      <w:r>
-        <w:rPr>
-          <w:rFonts w:ascii="Roboto" w:hAnsi="Roboto"/>
-          <w:color w:val="262626" w:themeColor="text1" w:themeTint="D9"/>
-          <w:sz w:val="18"/>
-          <w:szCs w:val="18"/>
-          <w:lang w:val="en-US"/>
-        </w:rPr>
-        <w:t>stack software solutions, ERP implementations, automation systems, and custom applications for businesses across multiple industries.</w:t>
+        <w:t xml:space="preserve">Delivered full stack software, and automation solutions across multiple industries, improving operational efficiency by up to </w:t>
+      </w:r>
+      <w:r>
+        <w:rPr>
+          <w:rFonts w:ascii="Roboto" w:hAnsi="Roboto"/>
+          <w:b/>
+          <w:bCs/>
+          <w:color w:val="262626" w:themeColor="text1" w:themeTint="D9"/>
+          <w:sz w:val="18"/>
+          <w:szCs w:val="18"/>
+          <w:lang w:val="en-US"/>
+        </w:rPr>
+        <w:t>40%.</w:t>
       </w:r>
     </w:p>
     <w:p>
@@ -355,29 +347,29 @@
           <w:szCs w:val="18"/>
           <w:lang w:val="en-US"/>
         </w:rPr>
-        <w:t xml:space="preserve">Deliver </w:t>
-      </w:r>
-      <w:r>
-        <w:rPr>
-          <w:rFonts w:ascii="Roboto" w:hAnsi="Roboto"/>
-          <w:b/>
-          <w:bCs/>
-          <w:color w:val="262626" w:themeColor="text1" w:themeTint="D9"/>
-          <w:sz w:val="18"/>
-          <w:szCs w:val="18"/>
-          <w:lang w:val="en-US"/>
-        </w:rPr>
-        <w:t>AI-powered solutions</w:t>
-      </w:r>
-      <w:r>
-        <w:rPr>
-          <w:rFonts w:ascii="Roboto" w:hAnsi="Roboto"/>
-          <w:color w:val="262626" w:themeColor="text1" w:themeTint="D9"/>
-          <w:sz w:val="18"/>
-          <w:szCs w:val="18"/>
-          <w:lang w:val="en-US"/>
-        </w:rPr>
-        <w:t xml:space="preserve"> that streamline operations, automate repetitive tasks, and improve productivity across business departments.</w:t>
+        <w:t xml:space="preserve">Deliver AI-powered solutions that reduced manual task time by </w:t>
+      </w:r>
+      <w:r>
+        <w:rPr>
+          <w:rFonts w:ascii="Roboto" w:hAnsi="Roboto"/>
+          <w:b/>
+          <w:bCs/>
+          <w:color w:val="262626" w:themeColor="text1" w:themeTint="D9"/>
+          <w:sz w:val="18"/>
+          <w:szCs w:val="18"/>
+          <w:lang w:val="en-US"/>
+        </w:rPr>
+        <w:t>30%</w:t>
+      </w:r>
+      <w:r>
+        <w:rPr>
+          <w:rFonts w:ascii="Roboto" w:hAnsi="Roboto"/>
+          <w:color w:val="262626" w:themeColor="text1" w:themeTint="D9"/>
+          <w:sz w:val="18"/>
+          <w:szCs w:val="18"/>
+          <w:lang w:val="en-US"/>
+        </w:rPr>
+        <w:t xml:space="preserve"> across business departments.</w:t>
       </w:r>
     </w:p>
     <w:p>
@@ -457,7 +449,41 @@
           <w:szCs w:val="18"/>
           <w:lang w:val="en-US"/>
         </w:rPr>
-        <w:t>Review code, mentor developers, and support the successful delivery of software projects.</w:t>
+        <w:t xml:space="preserve">Led code reviews, mentored developers, and supported delivery of software projects, improving team delivery speed by </w:t>
+      </w:r>
+      <w:r>
+        <w:rPr>
+          <w:rFonts w:ascii="Roboto" w:hAnsi="Roboto"/>
+          <w:b/>
+          <w:bCs/>
+          <w:color w:val="262626" w:themeColor="text1" w:themeTint="D9"/>
+          <w:sz w:val="18"/>
+          <w:szCs w:val="18"/>
+          <w:lang w:val="en-US"/>
+        </w:rPr>
+        <w:t>20%</w:t>
+      </w:r>
+      <w:r>
+        <w:rPr>
+          <w:rFonts w:ascii="Roboto" w:hAnsi="Roboto"/>
+          <w:color w:val="262626" w:themeColor="text1" w:themeTint="D9"/>
+          <w:sz w:val="18"/>
+          <w:szCs w:val="18"/>
+          <w:lang w:val="en-US"/>
+        </w:rPr>
+        <w:t xml:space="preserve"> and reducing production bugs by </w:t>
+      </w:r>
+      <w:r>
+        <w:rPr>
+          <w:rFonts w:ascii="Roboto" w:hAnsi="Roboto"/>
+          <w:b/>
+          <w:bCs/>
+          <w:color w:val="262626" w:themeColor="text1" w:themeTint="D9"/>
+          <w:sz w:val="18"/>
+          <w:szCs w:val="18"/>
+          <w:lang w:val="en-US"/>
+        </w:rPr>
+        <w:t>15–25%.</w:t>
       </w:r>
     </w:p>
     <w:p>

</xml_diff>

<commit_message>
Revise resume content to enhance clarity and detail.
- Updated job descriptions to better reflect skills and achievements.
- Improved educational background descriptions with specific focuses.
- Added hyperlinks for better accessibility to contact information and project references.
</commit_message>
<xml_diff>
--- a/public/resume.docx
+++ b/public/resume.docx
@@ -35,15 +35,17 @@
         <w:ind w:left="-576" w:right="144"/>
         <w:rPr>
           <w:rFonts w:ascii="Roboto" w:hAnsi="Roboto"/>
-          <w:lang w:val="en-US"/>
-        </w:rPr>
-      </w:pPr>
-      <w:r>
-        <w:rPr>
-          <w:rFonts w:ascii="Roboto" w:hAnsi="Roboto"/>
-          <w:color w:val="404040" w:themeColor="text1" w:themeTint="BF"/>
-          <w:sz w:val="20"/>
-          <w:szCs w:val="20"/>
+          <w:sz w:val="17"/>
+          <w:szCs w:val="17"/>
+          <w:lang w:val="en-US"/>
+        </w:rPr>
+      </w:pPr>
+      <w:r>
+        <w:rPr>
+          <w:rFonts w:ascii="Roboto" w:hAnsi="Roboto"/>
+          <w:color w:val="404040" w:themeColor="text1" w:themeTint="BF"/>
+          <w:sz w:val="17"/>
+          <w:szCs w:val="17"/>
           <w:lang w:val="en-US"/>
         </w:rPr>
         <w:t xml:space="preserve">Senior </w:t>
@@ -52,8 +54,8 @@
         <w:rPr>
           <w:rFonts w:ascii="Roboto" w:hAnsi="Roboto"/>
           <w:color w:val="404040" w:themeColor="text1" w:themeTint="BF"/>
-          <w:sz w:val="20"/>
-          <w:szCs w:val="20"/>
+          <w:sz w:val="17"/>
+          <w:szCs w:val="17"/>
           <w:lang w:val="en-US"/>
         </w:rPr>
         <w:t>Full Stack</w:t>
@@ -62,8 +64,8 @@
         <w:rPr>
           <w:rFonts w:ascii="Roboto" w:hAnsi="Roboto"/>
           <w:color w:val="404040" w:themeColor="text1" w:themeTint="BF"/>
-          <w:sz w:val="20"/>
-          <w:szCs w:val="20"/>
+          <w:sz w:val="17"/>
+          <w:szCs w:val="17"/>
           <w:lang w:val="en-US"/>
         </w:rPr>
         <w:t xml:space="preserve"> Engineer with </w:t>
@@ -74,8 +76,8 @@
           <w:b/>
           <w:bCs/>
           <w:color w:val="404040" w:themeColor="text1" w:themeTint="BF"/>
-          <w:sz w:val="20"/>
-          <w:szCs w:val="20"/>
+          <w:sz w:val="17"/>
+          <w:szCs w:val="17"/>
           <w:lang w:val="en-US"/>
         </w:rPr>
         <w:t>5+ years</w:t>
@@ -84,18 +86,38 @@
         <w:rPr>
           <w:rFonts w:ascii="Roboto" w:hAnsi="Roboto"/>
           <w:color w:val="404040" w:themeColor="text1" w:themeTint="BF"/>
-          <w:sz w:val="20"/>
-          <w:szCs w:val="20"/>
-          <w:lang w:val="en-US"/>
-        </w:rPr>
-        <w:t xml:space="preserve"> of experience designing, building, and delivering scalable software solutions, cloud infrastructure, and business automation systems across the full software lifecycle</w:t>
-      </w:r>
-      <w:r>
-        <w:rPr>
-          <w:rFonts w:ascii="Roboto" w:hAnsi="Roboto"/>
-          <w:color w:val="404040" w:themeColor="text1" w:themeTint="BF"/>
-          <w:sz w:val="20"/>
-          <w:szCs w:val="20"/>
+          <w:sz w:val="17"/>
+          <w:szCs w:val="17"/>
+          <w:lang w:val="en-US"/>
+        </w:rPr>
+        <w:t xml:space="preserve"> of experience designing, building, and delivering scalable software solutions</w:t>
+      </w:r>
+      <w:r>
+        <w:rPr>
+          <w:rFonts w:ascii="Roboto" w:hAnsi="Roboto"/>
+          <w:color w:val="404040" w:themeColor="text1" w:themeTint="BF"/>
+          <w:sz w:val="17"/>
+          <w:szCs w:val="17"/>
+          <w:lang w:val="en-US"/>
+        </w:rPr>
+        <w:t xml:space="preserve"> and </w:t>
+      </w:r>
+      <w:r>
+        <w:rPr>
+          <w:rFonts w:ascii="Roboto" w:hAnsi="Roboto"/>
+          <w:color w:val="404040" w:themeColor="text1" w:themeTint="BF"/>
+          <w:sz w:val="17"/>
+          <w:szCs w:val="17"/>
+          <w:lang w:val="en-US"/>
+        </w:rPr>
+        <w:t>cloud infrastructure</w:t>
+      </w:r>
+      <w:r>
+        <w:rPr>
+          <w:rFonts w:ascii="Roboto" w:hAnsi="Roboto"/>
+          <w:color w:val="404040" w:themeColor="text1" w:themeTint="BF"/>
+          <w:sz w:val="17"/>
+          <w:szCs w:val="17"/>
           <w:lang w:val="en-US"/>
         </w:rPr>
         <w:t>.</w:t>
@@ -126,7 +148,6 @@
     </w:p>
     <w:p>
       <w:pPr>
-        <w:spacing w:after="0"/>
         <w:ind w:left="-576" w:right="-144"/>
         <w:rPr>
           <w:rFonts w:ascii="Roboto" w:hAnsi="Roboto"/>
@@ -167,7 +188,7 @@
         </w:rPr>
         <w:t xml:space="preserve"> </w:t>
       </w:r>
-      <w:hyperlink r:id="rId5" w:history="1">
+      <w:hyperlink r:id="rId6" w:history="1">
         <w:r>
           <w:rPr>
             <w:rFonts w:ascii="Roboto" w:hAnsi="Roboto"/>
@@ -182,10 +203,7 @@
       </w:hyperlink>
       <w:r>
         <w:rPr>
-          <w:rFonts w:ascii="Roboto" w:hAnsi="Roboto" w:cs="Calibri"/>
-          <w:kern w:val="0"/>
-          <w:sz w:val="24"/>
-          <w:szCs w:val="24"/>
+          <w:rFonts w:ascii="Roboto" w:hAnsi="Roboto"/>
           <w:lang w:val="en-US"/>
         </w:rPr>
         <w:t xml:space="preserve"> </w:t>
@@ -198,57 +216,7 @@
           <w:szCs w:val="16"/>
           <w:lang w:val="en-US"/>
         </w:rPr>
-        <w:t>J</w:t>
-      </w:r>
-      <w:r>
-        <w:rPr>
-          <w:rFonts w:ascii="Roboto" w:hAnsi="Roboto"/>
-          <w:color w:val="595959" w:themeColor="text1" w:themeTint="A6"/>
-          <w:sz w:val="16"/>
-          <w:szCs w:val="16"/>
-          <w:lang w:val="en-US"/>
-        </w:rPr>
-        <w:t>an</w:t>
-      </w:r>
-      <w:r>
-        <w:rPr>
-          <w:rFonts w:ascii="Roboto" w:hAnsi="Roboto"/>
-          <w:color w:val="595959" w:themeColor="text1" w:themeTint="A6"/>
-          <w:sz w:val="16"/>
-          <w:szCs w:val="16"/>
-          <w:lang w:val="en-US"/>
-        </w:rPr>
-        <w:t xml:space="preserve"> 202</w:t>
-      </w:r>
-      <w:r>
-        <w:rPr>
-          <w:rFonts w:ascii="Roboto" w:hAnsi="Roboto"/>
-          <w:color w:val="595959" w:themeColor="text1" w:themeTint="A6"/>
-          <w:sz w:val="16"/>
-          <w:szCs w:val="16"/>
-          <w:lang w:val="en-US"/>
-        </w:rPr>
-        <w:t>5</w:t>
-      </w:r>
-      <w:r>
-        <w:rPr>
-          <w:rFonts w:ascii="Roboto" w:hAnsi="Roboto"/>
-          <w:color w:val="595959" w:themeColor="text1" w:themeTint="A6"/>
-          <w:sz w:val="16"/>
-          <w:szCs w:val="16"/>
-          <w:lang w:val="en-US"/>
-        </w:rPr>
-        <w:t xml:space="preserve"> — </w:t>
-      </w:r>
-      <w:r>
-        <w:rPr>
-          <w:rFonts w:ascii="Roboto" w:hAnsi="Roboto"/>
-          <w:color w:val="595959" w:themeColor="text1" w:themeTint="A6"/>
-          <w:sz w:val="16"/>
-          <w:szCs w:val="16"/>
-          <w:lang w:val="en-US"/>
-        </w:rPr>
-        <w:t>Present</w:t>
+        <w:t>Jan 2025 — Present</w:t>
       </w:r>
     </w:p>
     <w:p>
@@ -258,23 +226,23 @@
           <w:ilvl w:val="0"/>
           <w:numId w:val="1"/>
         </w:numPr>
-        <w:spacing w:after="100" w:line="240" w:lineRule="auto"/>
+        <w:spacing w:after="80" w:line="240" w:lineRule="auto"/>
         <w:ind w:left="-72" w:right="144"/>
         <w:contextualSpacing w:val="0"/>
         <w:rPr>
           <w:rFonts w:ascii="Roboto" w:hAnsi="Roboto"/>
           <w:color w:val="262626" w:themeColor="text1" w:themeTint="D9"/>
-          <w:sz w:val="18"/>
-          <w:szCs w:val="18"/>
-          <w:lang w:val="en-US"/>
-        </w:rPr>
-      </w:pPr>
-      <w:r>
-        <w:rPr>
-          <w:rFonts w:ascii="Roboto" w:hAnsi="Roboto"/>
-          <w:color w:val="262626" w:themeColor="text1" w:themeTint="D9"/>
-          <w:sz w:val="18"/>
-          <w:szCs w:val="18"/>
+          <w:sz w:val="17"/>
+          <w:szCs w:val="17"/>
+          <w:lang w:val="en-US"/>
+        </w:rPr>
+      </w:pPr>
+      <w:r>
+        <w:rPr>
+          <w:rFonts w:ascii="Roboto" w:hAnsi="Roboto"/>
+          <w:color w:val="262626" w:themeColor="text1" w:themeTint="D9"/>
+          <w:sz w:val="17"/>
+          <w:szCs w:val="17"/>
           <w:lang w:val="en-US"/>
         </w:rPr>
         <w:t xml:space="preserve">Delivered full stack software, and automation solutions across multiple industries, improving operational efficiency by up to </w:t>
@@ -285,8 +253,8 @@
           <w:b/>
           <w:bCs/>
           <w:color w:val="262626" w:themeColor="text1" w:themeTint="D9"/>
-          <w:sz w:val="18"/>
-          <w:szCs w:val="18"/>
+          <w:sz w:val="17"/>
+          <w:szCs w:val="17"/>
           <w:lang w:val="en-US"/>
         </w:rPr>
         <w:t>40%.</w:t>
@@ -299,23 +267,23 @@
           <w:ilvl w:val="0"/>
           <w:numId w:val="1"/>
         </w:numPr>
-        <w:spacing w:after="100" w:line="240" w:lineRule="auto"/>
+        <w:spacing w:after="80" w:line="240" w:lineRule="auto"/>
         <w:ind w:left="-72" w:right="144"/>
         <w:contextualSpacing w:val="0"/>
         <w:rPr>
           <w:rFonts w:ascii="Roboto" w:hAnsi="Roboto"/>
           <w:color w:val="262626" w:themeColor="text1" w:themeTint="D9"/>
-          <w:sz w:val="18"/>
-          <w:szCs w:val="18"/>
-          <w:lang w:val="en-US"/>
-        </w:rPr>
-      </w:pPr>
-      <w:r>
-        <w:rPr>
-          <w:rFonts w:ascii="Roboto" w:hAnsi="Roboto"/>
-          <w:color w:val="262626" w:themeColor="text1" w:themeTint="D9"/>
-          <w:sz w:val="18"/>
-          <w:szCs w:val="18"/>
+          <w:sz w:val="17"/>
+          <w:szCs w:val="17"/>
+          <w:lang w:val="en-US"/>
+        </w:rPr>
+      </w:pPr>
+      <w:r>
+        <w:rPr>
+          <w:rFonts w:ascii="Roboto" w:hAnsi="Roboto"/>
+          <w:color w:val="262626" w:themeColor="text1" w:themeTint="D9"/>
+          <w:sz w:val="17"/>
+          <w:szCs w:val="17"/>
           <w:lang w:val="en-US"/>
         </w:rPr>
         <w:t>Build and integrate applications, APIs, payment gateways, and third-party services to improve business processes and reduce manual work.</w:t>
@@ -328,23 +296,23 @@
           <w:ilvl w:val="0"/>
           <w:numId w:val="1"/>
         </w:numPr>
-        <w:spacing w:after="100" w:line="240" w:lineRule="auto"/>
+        <w:spacing w:after="80" w:line="240" w:lineRule="auto"/>
         <w:ind w:left="-72" w:right="144"/>
         <w:contextualSpacing w:val="0"/>
         <w:rPr>
           <w:rFonts w:ascii="Roboto" w:hAnsi="Roboto"/>
           <w:color w:val="262626" w:themeColor="text1" w:themeTint="D9"/>
-          <w:sz w:val="18"/>
-          <w:szCs w:val="18"/>
-          <w:lang w:val="en-US"/>
-        </w:rPr>
-      </w:pPr>
-      <w:r>
-        <w:rPr>
-          <w:rFonts w:ascii="Roboto" w:hAnsi="Roboto"/>
-          <w:color w:val="262626" w:themeColor="text1" w:themeTint="D9"/>
-          <w:sz w:val="18"/>
-          <w:szCs w:val="18"/>
+          <w:sz w:val="17"/>
+          <w:szCs w:val="17"/>
+          <w:lang w:val="en-US"/>
+        </w:rPr>
+      </w:pPr>
+      <w:r>
+        <w:rPr>
+          <w:rFonts w:ascii="Roboto" w:hAnsi="Roboto"/>
+          <w:color w:val="262626" w:themeColor="text1" w:themeTint="D9"/>
+          <w:sz w:val="17"/>
+          <w:szCs w:val="17"/>
           <w:lang w:val="en-US"/>
         </w:rPr>
         <w:t xml:space="preserve">Deliver AI-powered solutions that reduced manual task time by </w:t>
@@ -355,8 +323,8 @@
           <w:b/>
           <w:bCs/>
           <w:color w:val="262626" w:themeColor="text1" w:themeTint="D9"/>
-          <w:sz w:val="18"/>
-          <w:szCs w:val="18"/>
+          <w:sz w:val="17"/>
+          <w:szCs w:val="17"/>
           <w:lang w:val="en-US"/>
         </w:rPr>
         <w:t>30%</w:t>
@@ -365,8 +333,8 @@
         <w:rPr>
           <w:rFonts w:ascii="Roboto" w:hAnsi="Roboto"/>
           <w:color w:val="262626" w:themeColor="text1" w:themeTint="D9"/>
-          <w:sz w:val="18"/>
-          <w:szCs w:val="18"/>
+          <w:sz w:val="17"/>
+          <w:szCs w:val="17"/>
           <w:lang w:val="en-US"/>
         </w:rPr>
         <w:t xml:space="preserve"> across business departments.</w:t>
@@ -379,23 +347,23 @@
           <w:ilvl w:val="0"/>
           <w:numId w:val="1"/>
         </w:numPr>
-        <w:spacing w:after="100" w:line="240" w:lineRule="auto"/>
+        <w:spacing w:after="80" w:line="240" w:lineRule="auto"/>
         <w:ind w:left="-72" w:right="144"/>
         <w:contextualSpacing w:val="0"/>
         <w:rPr>
           <w:rFonts w:ascii="Roboto" w:hAnsi="Roboto"/>
           <w:color w:val="262626" w:themeColor="text1" w:themeTint="D9"/>
-          <w:sz w:val="18"/>
-          <w:szCs w:val="18"/>
-          <w:lang w:val="en-US"/>
-        </w:rPr>
-      </w:pPr>
-      <w:r>
-        <w:rPr>
-          <w:rFonts w:ascii="Roboto" w:hAnsi="Roboto"/>
-          <w:color w:val="262626" w:themeColor="text1" w:themeTint="D9"/>
-          <w:sz w:val="18"/>
-          <w:szCs w:val="18"/>
+          <w:sz w:val="17"/>
+          <w:szCs w:val="17"/>
+          <w:lang w:val="en-US"/>
+        </w:rPr>
+      </w:pPr>
+      <w:r>
+        <w:rPr>
+          <w:rFonts w:ascii="Roboto" w:hAnsi="Roboto"/>
+          <w:color w:val="262626" w:themeColor="text1" w:themeTint="D9"/>
+          <w:sz w:val="17"/>
+          <w:szCs w:val="17"/>
           <w:lang w:val="en-US"/>
         </w:rPr>
         <w:t xml:space="preserve">Design and maintain cloud infrastructure, reporting solutions, and data platforms using AWS, PostgreSQL, and </w:t>
@@ -403,11 +371,9 @@
       <w:r>
         <w:rPr>
           <w:rFonts w:ascii="Roboto" w:hAnsi="Roboto"/>
-          <w:b/>
-          <w:bCs/>
-          <w:color w:val="262626" w:themeColor="text1" w:themeTint="D9"/>
-          <w:sz w:val="18"/>
-          <w:szCs w:val="18"/>
+          <w:color w:val="262626" w:themeColor="text1" w:themeTint="D9"/>
+          <w:sz w:val="17"/>
+          <w:szCs w:val="17"/>
           <w:lang w:val="en-US"/>
         </w:rPr>
         <w:t>Power BI</w:t>
@@ -416,8 +382,8 @@
         <w:rPr>
           <w:rFonts w:ascii="Roboto" w:hAnsi="Roboto"/>
           <w:color w:val="262626" w:themeColor="text1" w:themeTint="D9"/>
-          <w:sz w:val="18"/>
-          <w:szCs w:val="18"/>
+          <w:sz w:val="17"/>
+          <w:szCs w:val="17"/>
           <w:lang w:val="en-US"/>
         </w:rPr>
         <w:t>.</w:t>
@@ -430,23 +396,23 @@
           <w:ilvl w:val="0"/>
           <w:numId w:val="1"/>
         </w:numPr>
-        <w:spacing w:after="100" w:line="240" w:lineRule="auto"/>
+        <w:spacing w:after="80" w:line="240" w:lineRule="auto"/>
         <w:ind w:left="-72" w:right="144"/>
         <w:contextualSpacing w:val="0"/>
         <w:rPr>
           <w:rFonts w:ascii="Roboto" w:hAnsi="Roboto"/>
           <w:color w:val="262626" w:themeColor="text1" w:themeTint="D9"/>
-          <w:sz w:val="18"/>
-          <w:szCs w:val="18"/>
-          <w:lang w:val="en-US"/>
-        </w:rPr>
-      </w:pPr>
-      <w:r>
-        <w:rPr>
-          <w:rFonts w:ascii="Roboto" w:hAnsi="Roboto"/>
-          <w:color w:val="262626" w:themeColor="text1" w:themeTint="D9"/>
-          <w:sz w:val="18"/>
-          <w:szCs w:val="18"/>
+          <w:sz w:val="17"/>
+          <w:szCs w:val="17"/>
+          <w:lang w:val="en-US"/>
+        </w:rPr>
+      </w:pPr>
+      <w:r>
+        <w:rPr>
+          <w:rFonts w:ascii="Roboto" w:hAnsi="Roboto"/>
+          <w:color w:val="262626" w:themeColor="text1" w:themeTint="D9"/>
+          <w:sz w:val="17"/>
+          <w:szCs w:val="17"/>
           <w:lang w:val="en-US"/>
         </w:rPr>
         <w:t xml:space="preserve">Led code reviews, mentored developers, and supported delivery of software projects, improving team delivery speed by </w:t>
@@ -457,8 +423,8 @@
           <w:b/>
           <w:bCs/>
           <w:color w:val="262626" w:themeColor="text1" w:themeTint="D9"/>
-          <w:sz w:val="18"/>
-          <w:szCs w:val="18"/>
+          <w:sz w:val="17"/>
+          <w:szCs w:val="17"/>
           <w:lang w:val="en-US"/>
         </w:rPr>
         <w:t>20%</w:t>
@@ -467,8 +433,8 @@
         <w:rPr>
           <w:rFonts w:ascii="Roboto" w:hAnsi="Roboto"/>
           <w:color w:val="262626" w:themeColor="text1" w:themeTint="D9"/>
-          <w:sz w:val="18"/>
-          <w:szCs w:val="18"/>
+          <w:sz w:val="17"/>
+          <w:szCs w:val="17"/>
           <w:lang w:val="en-US"/>
         </w:rPr>
         <w:t xml:space="preserve"> and reducing production bugs by </w:t>
@@ -479,8 +445,8 @@
           <w:b/>
           <w:bCs/>
           <w:color w:val="262626" w:themeColor="text1" w:themeTint="D9"/>
-          <w:sz w:val="18"/>
-          <w:szCs w:val="18"/>
+          <w:sz w:val="17"/>
+          <w:szCs w:val="17"/>
           <w:lang w:val="en-US"/>
         </w:rPr>
         <w:t>15–25%.</w:t>
@@ -488,7 +454,7 @@
     </w:p>
     <w:p>
       <w:pPr>
-        <w:spacing w:before="240" w:after="0"/>
+        <w:spacing w:before="240"/>
         <w:ind w:left="-576" w:right="-144"/>
         <w:rPr>
           <w:rFonts w:ascii="Roboto" w:hAnsi="Roboto"/>
@@ -529,7 +495,7 @@
         </w:rPr>
         <w:t xml:space="preserve"> </w:t>
       </w:r>
-      <w:hyperlink r:id="rId6" w:history="1">
+      <w:hyperlink r:id="rId7" w:history="1">
         <w:r>
           <w:rPr>
             <w:rFonts w:ascii="Roboto" w:hAnsi="Roboto"/>
@@ -619,23 +585,23 @@
           <w:ilvl w:val="0"/>
           <w:numId w:val="1"/>
         </w:numPr>
-        <w:spacing w:after="100" w:line="240" w:lineRule="auto"/>
+        <w:spacing w:after="80" w:line="240" w:lineRule="auto"/>
         <w:ind w:left="-72" w:right="144"/>
         <w:contextualSpacing w:val="0"/>
         <w:rPr>
           <w:rFonts w:ascii="Roboto" w:hAnsi="Roboto"/>
           <w:color w:val="262626" w:themeColor="text1" w:themeTint="D9"/>
-          <w:sz w:val="18"/>
-          <w:szCs w:val="18"/>
-          <w:lang w:val="en-US"/>
-        </w:rPr>
-      </w:pPr>
-      <w:r>
-        <w:rPr>
-          <w:rFonts w:ascii="Roboto" w:hAnsi="Roboto"/>
-          <w:color w:val="262626" w:themeColor="text1" w:themeTint="D9"/>
-          <w:sz w:val="18"/>
-          <w:szCs w:val="18"/>
+          <w:sz w:val="17"/>
+          <w:szCs w:val="17"/>
+          <w:lang w:val="en-US"/>
+        </w:rPr>
+      </w:pPr>
+      <w:r>
+        <w:rPr>
+          <w:rFonts w:ascii="Roboto" w:hAnsi="Roboto"/>
+          <w:color w:val="262626" w:themeColor="text1" w:themeTint="D9"/>
+          <w:sz w:val="17"/>
+          <w:szCs w:val="17"/>
           <w:lang w:val="en-US"/>
         </w:rPr>
         <w:t xml:space="preserve">Delivered </w:t>
@@ -646,8 +612,8 @@
           <w:b/>
           <w:bCs/>
           <w:color w:val="262626" w:themeColor="text1" w:themeTint="D9"/>
-          <w:sz w:val="18"/>
-          <w:szCs w:val="18"/>
+          <w:sz w:val="17"/>
+          <w:szCs w:val="17"/>
           <w:lang w:val="en-US"/>
         </w:rPr>
         <w:t>10+ scalable web solutions</w:t>
@@ -656,8 +622,8 @@
         <w:rPr>
           <w:rFonts w:ascii="Roboto" w:hAnsi="Roboto"/>
           <w:color w:val="262626" w:themeColor="text1" w:themeTint="D9"/>
-          <w:sz w:val="18"/>
-          <w:szCs w:val="18"/>
+          <w:sz w:val="17"/>
+          <w:szCs w:val="17"/>
           <w:lang w:val="en-US"/>
         </w:rPr>
         <w:t xml:space="preserve"> using React, Next.js, Node.js, and Odoo, aligning technical implementations with business requirements.</w:t>
@@ -670,23 +636,23 @@
           <w:ilvl w:val="0"/>
           <w:numId w:val="1"/>
         </w:numPr>
-        <w:spacing w:after="100" w:line="240" w:lineRule="auto"/>
+        <w:spacing w:after="80" w:line="240" w:lineRule="auto"/>
         <w:ind w:left="-72" w:right="144"/>
         <w:contextualSpacing w:val="0"/>
         <w:rPr>
           <w:rFonts w:ascii="Roboto" w:hAnsi="Roboto"/>
           <w:color w:val="262626" w:themeColor="text1" w:themeTint="D9"/>
-          <w:sz w:val="18"/>
-          <w:szCs w:val="18"/>
-          <w:lang w:val="en-US"/>
-        </w:rPr>
-      </w:pPr>
-      <w:r>
-        <w:rPr>
-          <w:rFonts w:ascii="Roboto" w:hAnsi="Roboto"/>
-          <w:color w:val="262626" w:themeColor="text1" w:themeTint="D9"/>
-          <w:sz w:val="18"/>
-          <w:szCs w:val="18"/>
+          <w:sz w:val="17"/>
+          <w:szCs w:val="17"/>
+          <w:lang w:val="en-US"/>
+        </w:rPr>
+      </w:pPr>
+      <w:r>
+        <w:rPr>
+          <w:rFonts w:ascii="Roboto" w:hAnsi="Roboto"/>
+          <w:color w:val="262626" w:themeColor="text1" w:themeTint="D9"/>
+          <w:sz w:val="17"/>
+          <w:szCs w:val="17"/>
           <w:lang w:val="en-US"/>
         </w:rPr>
         <w:t xml:space="preserve">Led the architecture and development of web applications, APIs, integrations, and internal tools, improving operational efficiency and reducing manual processes by </w:t>
@@ -697,8 +663,8 @@
           <w:b/>
           <w:bCs/>
           <w:color w:val="262626" w:themeColor="text1" w:themeTint="D9"/>
-          <w:sz w:val="18"/>
-          <w:szCs w:val="18"/>
+          <w:sz w:val="17"/>
+          <w:szCs w:val="17"/>
           <w:lang w:val="en-US"/>
         </w:rPr>
         <w:t>25%</w:t>
@@ -707,8 +673,8 @@
         <w:rPr>
           <w:rFonts w:ascii="Roboto" w:hAnsi="Roboto"/>
           <w:color w:val="262626" w:themeColor="text1" w:themeTint="D9"/>
-          <w:sz w:val="18"/>
-          <w:szCs w:val="18"/>
+          <w:sz w:val="17"/>
+          <w:szCs w:val="17"/>
           <w:lang w:val="en-US"/>
         </w:rPr>
         <w:t>.</w:t>
@@ -721,23 +687,23 @@
           <w:ilvl w:val="0"/>
           <w:numId w:val="1"/>
         </w:numPr>
-        <w:spacing w:after="100" w:line="240" w:lineRule="auto"/>
+        <w:spacing w:after="80" w:line="240" w:lineRule="auto"/>
         <w:ind w:left="-72" w:right="144"/>
         <w:contextualSpacing w:val="0"/>
         <w:rPr>
           <w:rFonts w:ascii="Roboto" w:hAnsi="Roboto"/>
           <w:color w:val="262626" w:themeColor="text1" w:themeTint="D9"/>
-          <w:sz w:val="18"/>
-          <w:szCs w:val="18"/>
-          <w:lang w:val="en-US"/>
-        </w:rPr>
-      </w:pPr>
-      <w:r>
-        <w:rPr>
-          <w:rFonts w:ascii="Roboto" w:hAnsi="Roboto"/>
-          <w:color w:val="262626" w:themeColor="text1" w:themeTint="D9"/>
-          <w:sz w:val="18"/>
-          <w:szCs w:val="18"/>
+          <w:sz w:val="17"/>
+          <w:szCs w:val="17"/>
+          <w:lang w:val="en-US"/>
+        </w:rPr>
+      </w:pPr>
+      <w:r>
+        <w:rPr>
+          <w:rFonts w:ascii="Roboto" w:hAnsi="Roboto"/>
+          <w:color w:val="262626" w:themeColor="text1" w:themeTint="D9"/>
+          <w:sz w:val="17"/>
+          <w:szCs w:val="17"/>
           <w:lang w:val="en-US"/>
         </w:rPr>
         <w:t xml:space="preserve">Designed and implemented electronic invoicing integrations with </w:t>
@@ -745,11 +711,9 @@
       <w:r>
         <w:rPr>
           <w:rFonts w:ascii="Roboto" w:hAnsi="Roboto"/>
-          <w:b/>
-          <w:bCs/>
-          <w:color w:val="262626" w:themeColor="text1" w:themeTint="D9"/>
-          <w:sz w:val="18"/>
-          <w:szCs w:val="18"/>
+          <w:color w:val="262626" w:themeColor="text1" w:themeTint="D9"/>
+          <w:sz w:val="17"/>
+          <w:szCs w:val="17"/>
           <w:lang w:val="en-US"/>
         </w:rPr>
         <w:t>DGII</w:t>
@@ -758,8 +722,8 @@
         <w:rPr>
           <w:rFonts w:ascii="Roboto" w:hAnsi="Roboto"/>
           <w:color w:val="262626" w:themeColor="text1" w:themeTint="D9"/>
-          <w:sz w:val="18"/>
-          <w:szCs w:val="18"/>
+          <w:sz w:val="17"/>
+          <w:szCs w:val="17"/>
           <w:lang w:val="en-US"/>
         </w:rPr>
         <w:t xml:space="preserve"> using C# and .NET, automating fiscal document workflows and compliance processes.</w:t>
@@ -772,23 +736,23 @@
           <w:ilvl w:val="0"/>
           <w:numId w:val="1"/>
         </w:numPr>
-        <w:spacing w:after="100" w:line="240" w:lineRule="auto"/>
+        <w:spacing w:after="80" w:line="240" w:lineRule="auto"/>
         <w:ind w:left="-72" w:right="144"/>
         <w:contextualSpacing w:val="0"/>
         <w:rPr>
           <w:rFonts w:ascii="Roboto" w:hAnsi="Roboto"/>
           <w:color w:val="262626" w:themeColor="text1" w:themeTint="D9"/>
-          <w:sz w:val="18"/>
-          <w:szCs w:val="18"/>
-          <w:lang w:val="en-US"/>
-        </w:rPr>
-      </w:pPr>
-      <w:r>
-        <w:rPr>
-          <w:rFonts w:ascii="Roboto" w:hAnsi="Roboto"/>
-          <w:color w:val="262626" w:themeColor="text1" w:themeTint="D9"/>
-          <w:sz w:val="18"/>
-          <w:szCs w:val="18"/>
+          <w:sz w:val="17"/>
+          <w:szCs w:val="17"/>
+          <w:lang w:val="en-US"/>
+        </w:rPr>
+      </w:pPr>
+      <w:r>
+        <w:rPr>
+          <w:rFonts w:ascii="Roboto" w:hAnsi="Roboto"/>
+          <w:color w:val="262626" w:themeColor="text1" w:themeTint="D9"/>
+          <w:sz w:val="17"/>
+          <w:szCs w:val="17"/>
           <w:lang w:val="en-US"/>
         </w:rPr>
         <w:t xml:space="preserve">Integrated enterprise systems and client applications into unified platforms, reducing operational costs by </w:t>
@@ -799,8 +763,8 @@
           <w:b/>
           <w:bCs/>
           <w:color w:val="262626" w:themeColor="text1" w:themeTint="D9"/>
-          <w:sz w:val="18"/>
-          <w:szCs w:val="18"/>
+          <w:sz w:val="17"/>
+          <w:szCs w:val="17"/>
           <w:lang w:val="en-US"/>
         </w:rPr>
         <w:t>15%</w:t>
@@ -809,8 +773,8 @@
         <w:rPr>
           <w:rFonts w:ascii="Roboto" w:hAnsi="Roboto"/>
           <w:color w:val="262626" w:themeColor="text1" w:themeTint="D9"/>
-          <w:sz w:val="18"/>
-          <w:szCs w:val="18"/>
+          <w:sz w:val="17"/>
+          <w:szCs w:val="17"/>
           <w:lang w:val="en-US"/>
         </w:rPr>
         <w:t xml:space="preserve"> and improving overall system performance.</w:t>
@@ -850,7 +814,7 @@
         </w:rPr>
         <w:t xml:space="preserve">· </w:t>
       </w:r>
-      <w:hyperlink r:id="rId7" w:history="1">
+      <w:hyperlink r:id="rId8" w:history="1">
         <w:r>
           <w:rPr>
             <w:rFonts w:ascii="Roboto" w:hAnsi="Roboto"/>
@@ -940,45 +904,43 @@
           <w:ilvl w:val="0"/>
           <w:numId w:val="1"/>
         </w:numPr>
-        <w:spacing w:after="100" w:line="240" w:lineRule="auto"/>
+        <w:spacing w:after="80" w:line="240" w:lineRule="auto"/>
         <w:ind w:left="-72" w:right="144"/>
         <w:contextualSpacing w:val="0"/>
         <w:rPr>
           <w:rFonts w:ascii="Roboto" w:hAnsi="Roboto"/>
           <w:color w:val="262626" w:themeColor="text1" w:themeTint="D9"/>
-          <w:sz w:val="18"/>
-          <w:szCs w:val="18"/>
-          <w:lang w:val="en-US"/>
-        </w:rPr>
-      </w:pPr>
-      <w:r>
-        <w:rPr>
-          <w:rFonts w:ascii="Roboto" w:hAnsi="Roboto"/>
-          <w:color w:val="262626" w:themeColor="text1" w:themeTint="D9"/>
-          <w:sz w:val="18"/>
-          <w:szCs w:val="18"/>
-          <w:lang w:val="en-US"/>
-        </w:rPr>
-        <w:t xml:space="preserve">Enhanced </w:t>
-      </w:r>
-      <w:r>
-        <w:rPr>
-          <w:rFonts w:ascii="Roboto" w:hAnsi="Roboto"/>
-          <w:b/>
-          <w:bCs/>
-          <w:color w:val="262626" w:themeColor="text1" w:themeTint="D9"/>
-          <w:sz w:val="18"/>
-          <w:szCs w:val="18"/>
-          <w:lang w:val="en-US"/>
-        </w:rPr>
-        <w:t>e-commerce platforms</w:t>
-      </w:r>
-      <w:r>
-        <w:rPr>
-          <w:rFonts w:ascii="Roboto" w:hAnsi="Roboto"/>
-          <w:color w:val="262626" w:themeColor="text1" w:themeTint="D9"/>
-          <w:sz w:val="18"/>
-          <w:szCs w:val="18"/>
+          <w:sz w:val="17"/>
+          <w:szCs w:val="17"/>
+          <w:lang w:val="en-US"/>
+        </w:rPr>
+      </w:pPr>
+      <w:r>
+        <w:rPr>
+          <w:rFonts w:ascii="Roboto" w:hAnsi="Roboto"/>
+          <w:color w:val="262626" w:themeColor="text1" w:themeTint="D9"/>
+          <w:sz w:val="17"/>
+          <w:szCs w:val="17"/>
+          <w:lang w:val="en-US"/>
+        </w:rPr>
+        <w:t>Enhanced</w:t>
+      </w:r>
+      <w:r>
+        <w:rPr>
+          <w:rFonts w:ascii="Roboto" w:hAnsi="Roboto"/>
+          <w:color w:val="262626" w:themeColor="text1" w:themeTint="D9"/>
+          <w:sz w:val="17"/>
+          <w:szCs w:val="17"/>
+          <w:lang w:val="en-US"/>
+        </w:rPr>
+        <w:t xml:space="preserve"> e-commerce platforms</w:t>
+      </w:r>
+      <w:r>
+        <w:rPr>
+          <w:rFonts w:ascii="Roboto" w:hAnsi="Roboto"/>
+          <w:color w:val="262626" w:themeColor="text1" w:themeTint="D9"/>
+          <w:sz w:val="17"/>
+          <w:szCs w:val="17"/>
           <w:lang w:val="en-US"/>
         </w:rPr>
         <w:t xml:space="preserve"> using React, improving user experience, accessibility, and customer engagement.</w:t>
@@ -991,23 +953,23 @@
           <w:ilvl w:val="0"/>
           <w:numId w:val="1"/>
         </w:numPr>
-        <w:spacing w:after="100" w:line="240" w:lineRule="auto"/>
+        <w:spacing w:after="80" w:line="240" w:lineRule="auto"/>
         <w:ind w:left="-72" w:right="144"/>
         <w:contextualSpacing w:val="0"/>
         <w:rPr>
           <w:rFonts w:ascii="Roboto" w:hAnsi="Roboto"/>
           <w:color w:val="262626" w:themeColor="text1" w:themeTint="D9"/>
-          <w:sz w:val="18"/>
-          <w:szCs w:val="18"/>
-          <w:lang w:val="en-US"/>
-        </w:rPr>
-      </w:pPr>
-      <w:r>
-        <w:rPr>
-          <w:rFonts w:ascii="Roboto" w:hAnsi="Roboto"/>
-          <w:color w:val="262626" w:themeColor="text1" w:themeTint="D9"/>
-          <w:sz w:val="18"/>
-          <w:szCs w:val="18"/>
+          <w:sz w:val="17"/>
+          <w:szCs w:val="17"/>
+          <w:lang w:val="en-US"/>
+        </w:rPr>
+      </w:pPr>
+      <w:r>
+        <w:rPr>
+          <w:rFonts w:ascii="Roboto" w:hAnsi="Roboto"/>
+          <w:color w:val="262626" w:themeColor="text1" w:themeTint="D9"/>
+          <w:sz w:val="17"/>
+          <w:szCs w:val="17"/>
           <w:lang w:val="en-US"/>
         </w:rPr>
         <w:t>Developed custom invoicing solutions that streamlined financial workflows and improved document accuracy.</w:t>
@@ -1020,23 +982,23 @@
           <w:ilvl w:val="0"/>
           <w:numId w:val="1"/>
         </w:numPr>
-        <w:spacing w:after="100" w:line="240" w:lineRule="auto"/>
+        <w:spacing w:after="80" w:line="240" w:lineRule="auto"/>
         <w:ind w:left="-72" w:right="144"/>
         <w:contextualSpacing w:val="0"/>
         <w:rPr>
           <w:rFonts w:ascii="Roboto" w:hAnsi="Roboto"/>
           <w:color w:val="262626" w:themeColor="text1" w:themeTint="D9"/>
-          <w:sz w:val="18"/>
-          <w:szCs w:val="18"/>
-          <w:lang w:val="en-US"/>
-        </w:rPr>
-      </w:pPr>
-      <w:r>
-        <w:rPr>
-          <w:rFonts w:ascii="Roboto" w:hAnsi="Roboto"/>
-          <w:color w:val="262626" w:themeColor="text1" w:themeTint="D9"/>
-          <w:sz w:val="18"/>
-          <w:szCs w:val="18"/>
+          <w:sz w:val="17"/>
+          <w:szCs w:val="17"/>
+          <w:lang w:val="en-US"/>
+        </w:rPr>
+      </w:pPr>
+      <w:r>
+        <w:rPr>
+          <w:rFonts w:ascii="Roboto" w:hAnsi="Roboto"/>
+          <w:color w:val="262626" w:themeColor="text1" w:themeTint="D9"/>
+          <w:sz w:val="17"/>
+          <w:szCs w:val="17"/>
           <w:lang w:val="en-US"/>
         </w:rPr>
         <w:t>Built and maintained full-stack applications using React, Node.js, and Python, improving system performance and reliability.</w:t>
@@ -1076,7 +1038,7 @@
         </w:rPr>
         <w:t xml:space="preserve">· </w:t>
       </w:r>
-      <w:hyperlink r:id="rId8" w:history="1">
+      <w:hyperlink r:id="rId9" w:history="1">
         <w:proofErr w:type="spellStart"/>
         <w:r>
           <w:rPr>
@@ -1179,23 +1141,23 @@
           <w:ilvl w:val="0"/>
           <w:numId w:val="1"/>
         </w:numPr>
-        <w:spacing w:after="100" w:line="240" w:lineRule="auto"/>
+        <w:spacing w:after="80" w:line="240" w:lineRule="auto"/>
         <w:ind w:left="-72" w:right="144"/>
         <w:contextualSpacing w:val="0"/>
         <w:rPr>
           <w:rFonts w:ascii="Roboto" w:hAnsi="Roboto"/>
           <w:color w:val="262626" w:themeColor="text1" w:themeTint="D9"/>
-          <w:sz w:val="18"/>
-          <w:szCs w:val="18"/>
-          <w:lang w:val="en-US"/>
-        </w:rPr>
-      </w:pPr>
-      <w:r>
-        <w:rPr>
-          <w:rFonts w:ascii="Roboto" w:hAnsi="Roboto"/>
-          <w:color w:val="262626" w:themeColor="text1" w:themeTint="D9"/>
-          <w:sz w:val="18"/>
-          <w:szCs w:val="18"/>
+          <w:sz w:val="17"/>
+          <w:szCs w:val="17"/>
+          <w:lang w:val="en-US"/>
+        </w:rPr>
+      </w:pPr>
+      <w:r>
+        <w:rPr>
+          <w:rFonts w:ascii="Roboto" w:hAnsi="Roboto"/>
+          <w:color w:val="262626" w:themeColor="text1" w:themeTint="D9"/>
+          <w:sz w:val="17"/>
+          <w:szCs w:val="17"/>
           <w:lang w:val="en-US"/>
         </w:rPr>
         <w:t xml:space="preserve">Migrated and enhanced </w:t>
@@ -1206,8 +1168,8 @@
           <w:b/>
           <w:bCs/>
           <w:color w:val="262626" w:themeColor="text1" w:themeTint="D9"/>
-          <w:sz w:val="18"/>
-          <w:szCs w:val="18"/>
+          <w:sz w:val="17"/>
+          <w:szCs w:val="17"/>
           <w:lang w:val="en-US"/>
         </w:rPr>
         <w:t>8+ Odoo modules</w:t>
@@ -1216,8 +1178,8 @@
         <w:rPr>
           <w:rFonts w:ascii="Roboto" w:hAnsi="Roboto"/>
           <w:color w:val="262626" w:themeColor="text1" w:themeTint="D9"/>
-          <w:sz w:val="18"/>
-          <w:szCs w:val="18"/>
+          <w:sz w:val="17"/>
+          <w:szCs w:val="17"/>
           <w:lang w:val="en-US"/>
         </w:rPr>
         <w:t xml:space="preserve"> using Python and JavaScript, improving maintainability and delivery efficiency.</w:t>
@@ -1230,23 +1192,23 @@
           <w:ilvl w:val="0"/>
           <w:numId w:val="1"/>
         </w:numPr>
-        <w:spacing w:after="100" w:line="240" w:lineRule="auto"/>
+        <w:spacing w:after="80" w:line="240" w:lineRule="auto"/>
         <w:ind w:left="-72" w:right="144"/>
         <w:contextualSpacing w:val="0"/>
         <w:rPr>
           <w:rFonts w:ascii="Roboto" w:hAnsi="Roboto"/>
           <w:color w:val="262626" w:themeColor="text1" w:themeTint="D9"/>
-          <w:sz w:val="18"/>
-          <w:szCs w:val="18"/>
-          <w:lang w:val="en-US"/>
-        </w:rPr>
-      </w:pPr>
-      <w:r>
-        <w:rPr>
-          <w:rFonts w:ascii="Roboto" w:hAnsi="Roboto"/>
-          <w:color w:val="262626" w:themeColor="text1" w:themeTint="D9"/>
-          <w:sz w:val="18"/>
-          <w:szCs w:val="18"/>
+          <w:sz w:val="17"/>
+          <w:szCs w:val="17"/>
+          <w:lang w:val="en-US"/>
+        </w:rPr>
+      </w:pPr>
+      <w:r>
+        <w:rPr>
+          <w:rFonts w:ascii="Roboto" w:hAnsi="Roboto"/>
+          <w:color w:val="262626" w:themeColor="text1" w:themeTint="D9"/>
+          <w:sz w:val="17"/>
+          <w:szCs w:val="17"/>
           <w:lang w:val="en-US"/>
         </w:rPr>
         <w:t>Integrated third-party APIs to extend platform capabilities and support client-specific business requirements.</w:t>
@@ -1259,280 +1221,395 @@
           <w:ilvl w:val="0"/>
           <w:numId w:val="1"/>
         </w:numPr>
-        <w:spacing w:after="100" w:line="240" w:lineRule="auto"/>
+        <w:spacing w:after="80" w:line="240" w:lineRule="auto"/>
         <w:ind w:left="-72" w:right="144"/>
         <w:contextualSpacing w:val="0"/>
         <w:rPr>
           <w:rFonts w:ascii="Roboto" w:hAnsi="Roboto"/>
           <w:color w:val="262626" w:themeColor="text1" w:themeTint="D9"/>
+          <w:sz w:val="17"/>
+          <w:szCs w:val="17"/>
+          <w:lang w:val="en-US"/>
+        </w:rPr>
+      </w:pPr>
+      <w:r>
+        <w:rPr>
+          <w:rFonts w:ascii="Roboto" w:hAnsi="Roboto"/>
+          <w:color w:val="262626" w:themeColor="text1" w:themeTint="D9"/>
+          <w:sz w:val="17"/>
+          <w:szCs w:val="17"/>
+          <w:lang w:val="en-US"/>
+        </w:rPr>
+        <w:t xml:space="preserve">Introduced code review and </w:t>
+      </w:r>
+      <w:r>
+        <w:rPr>
+          <w:rFonts w:ascii="Roboto" w:hAnsi="Roboto"/>
+          <w:b/>
+          <w:bCs/>
+          <w:color w:val="262626" w:themeColor="text1" w:themeTint="D9"/>
+          <w:sz w:val="17"/>
+          <w:szCs w:val="17"/>
+          <w:lang w:val="en-US"/>
+        </w:rPr>
+        <w:t>Agile practices</w:t>
+      </w:r>
+      <w:r>
+        <w:rPr>
+          <w:rFonts w:ascii="Roboto" w:hAnsi="Roboto"/>
+          <w:color w:val="262626" w:themeColor="text1" w:themeTint="D9"/>
+          <w:sz w:val="17"/>
+          <w:szCs w:val="17"/>
+          <w:lang w:val="en-US"/>
+        </w:rPr>
+        <w:t xml:space="preserve"> that improved team collaboration and accelerated project delivery.</w:t>
+      </w:r>
+    </w:p>
+    <w:p>
+      <w:pPr>
+        <w:pStyle w:val="Prrafodelista"/>
+        <w:spacing w:after="0" w:line="240" w:lineRule="auto"/>
+        <w:ind w:left="-72" w:right="144"/>
+        <w:contextualSpacing w:val="0"/>
+        <w:rPr>
+          <w:rFonts w:ascii="Roboto" w:hAnsi="Roboto"/>
+          <w:color w:val="262626" w:themeColor="text1" w:themeTint="D9"/>
+          <w:sz w:val="17"/>
+          <w:szCs w:val="17"/>
+          <w:lang w:val="en-US"/>
+        </w:rPr>
+      </w:pPr>
+    </w:p>
+    <w:p>
+      <w:pPr>
+        <w:spacing w:before="240" w:after="100" w:line="276" w:lineRule="auto"/>
+        <w:ind w:left="-432" w:right="144"/>
+        <w:rPr>
+          <w:rFonts w:ascii="Roboto" w:hAnsi="Roboto"/>
+          <w:b/>
+          <w:bCs/>
+          <w:color w:val="194CE5"/>
+          <w:lang w:val="en-US"/>
+        </w:rPr>
+      </w:pPr>
+      <w:r>
+        <w:rPr>
+          <w:rFonts w:ascii="Roboto" w:hAnsi="Roboto"/>
+          <w:b/>
+          <w:bCs/>
+          <w:color w:val="194CE5"/>
+          <w:lang w:val="en-US"/>
+        </w:rPr>
+        <w:t>Education</w:t>
+      </w:r>
+    </w:p>
+    <w:p>
+      <w:pPr>
+        <w:spacing w:after="100" w:line="240" w:lineRule="auto"/>
+        <w:ind w:left="-432" w:right="144"/>
+        <w:rPr>
+          <w:rFonts w:ascii="Roboto" w:hAnsi="Roboto"/>
+          <w:color w:val="404040" w:themeColor="text1" w:themeTint="BF"/>
           <w:sz w:val="18"/>
           <w:szCs w:val="18"/>
           <w:lang w:val="en-US"/>
         </w:rPr>
       </w:pPr>
-      <w:r>
-        <w:rPr>
-          <w:rFonts w:ascii="Roboto" w:hAnsi="Roboto"/>
-          <w:color w:val="262626" w:themeColor="text1" w:themeTint="D9"/>
-          <w:sz w:val="18"/>
-          <w:szCs w:val="18"/>
-          <w:lang w:val="en-US"/>
-        </w:rPr>
-        <w:t xml:space="preserve">Introduced code review and </w:t>
-      </w:r>
-      <w:r>
-        <w:rPr>
-          <w:rFonts w:ascii="Roboto" w:hAnsi="Roboto"/>
-          <w:b/>
-          <w:bCs/>
-          <w:color w:val="262626" w:themeColor="text1" w:themeTint="D9"/>
-          <w:sz w:val="18"/>
-          <w:szCs w:val="18"/>
-          <w:lang w:val="en-US"/>
-        </w:rPr>
-        <w:t>Agile practices</w:t>
-      </w:r>
-      <w:r>
-        <w:rPr>
-          <w:rFonts w:ascii="Roboto" w:hAnsi="Roboto"/>
-          <w:color w:val="262626" w:themeColor="text1" w:themeTint="D9"/>
-          <w:sz w:val="18"/>
-          <w:szCs w:val="18"/>
-          <w:lang w:val="en-US"/>
-        </w:rPr>
-        <w:t xml:space="preserve"> that improved team collaboration and accelerated project delivery.</w:t>
-      </w:r>
-    </w:p>
-    <w:p>
-      <w:pPr>
-        <w:pStyle w:val="Prrafodelista"/>
-        <w:spacing w:after="100" w:line="240" w:lineRule="auto"/>
-        <w:ind w:left="-72" w:right="144"/>
-        <w:contextualSpacing w:val="0"/>
-        <w:rPr>
-          <w:rFonts w:ascii="Roboto" w:hAnsi="Roboto"/>
-          <w:color w:val="262626" w:themeColor="text1" w:themeTint="D9"/>
-          <w:sz w:val="17"/>
-          <w:szCs w:val="17"/>
-          <w:lang w:val="en-US"/>
-        </w:rPr>
-      </w:pPr>
-    </w:p>
-    <w:p>
-      <w:pPr>
-        <w:spacing w:after="100" w:line="276" w:lineRule="auto"/>
-        <w:ind w:left="-432" w:right="144"/>
-        <w:rPr>
-          <w:rFonts w:ascii="Roboto" w:hAnsi="Roboto"/>
-          <w:b/>
-          <w:bCs/>
-          <w:color w:val="194CE5"/>
-          <w:lang w:val="en-US"/>
-        </w:rPr>
-      </w:pPr>
-      <w:r>
-        <w:rPr>
-          <w:rFonts w:ascii="Roboto" w:hAnsi="Roboto"/>
-          <w:b/>
-          <w:bCs/>
-          <w:color w:val="194CE5"/>
-          <w:lang w:val="en-US"/>
-        </w:rPr>
-        <w:t>Education</w:t>
-      </w:r>
-    </w:p>
-    <w:p>
-      <w:pPr>
-        <w:spacing w:after="100" w:line="240" w:lineRule="auto"/>
-        <w:ind w:left="-432" w:right="144"/>
-        <w:rPr>
-          <w:rFonts w:ascii="Roboto" w:hAnsi="Roboto"/>
-          <w:color w:val="404040" w:themeColor="text1" w:themeTint="BF"/>
-          <w:sz w:val="18"/>
-          <w:szCs w:val="18"/>
-          <w:lang w:val="en-US"/>
-        </w:rPr>
-      </w:pPr>
-      <w:r>
-        <w:rPr>
-          <w:rFonts w:ascii="Roboto" w:hAnsi="Roboto"/>
-          <w:b/>
-          <w:bCs/>
-          <w:sz w:val="20"/>
-          <w:szCs w:val="20"/>
-          <w:lang w:val="en-US"/>
-        </w:rPr>
-        <w:t>Universidad Iberoamericana (UNIBE)</w:t>
-      </w:r>
-      <w:r>
-        <w:rPr>
-          <w:rFonts w:ascii="Roboto" w:hAnsi="Roboto"/>
-          <w:b/>
-          <w:bCs/>
-          <w:sz w:val="20"/>
-          <w:szCs w:val="20"/>
-          <w:lang w:val="en-US"/>
-        </w:rPr>
-        <w:br/>
-      </w:r>
-      <w:r>
-        <w:rPr>
-          <w:rFonts w:ascii="Roboto" w:hAnsi="Roboto"/>
-          <w:color w:val="404040" w:themeColor="text1" w:themeTint="BF"/>
-          <w:sz w:val="18"/>
-          <w:szCs w:val="18"/>
-          <w:lang w:val="en-US"/>
-        </w:rPr>
-        <w:t>B.S. in Computational Technologies Engineering</w:t>
-      </w:r>
-    </w:p>
-    <w:p>
-      <w:pPr>
-        <w:spacing w:before="240" w:after="0" w:line="240" w:lineRule="auto"/>
-        <w:ind w:left="-432" w:right="144"/>
-        <w:rPr>
-          <w:rFonts w:ascii="Roboto" w:hAnsi="Roboto"/>
-          <w:b/>
-          <w:bCs/>
-          <w:sz w:val="20"/>
-          <w:szCs w:val="20"/>
-          <w:lang w:val="es-DO"/>
-        </w:rPr>
-      </w:pPr>
-      <w:r>
-        <w:rPr>
-          <w:rFonts w:ascii="Roboto" w:hAnsi="Roboto"/>
-          <w:b/>
-          <w:bCs/>
-          <w:sz w:val="20"/>
-          <w:szCs w:val="20"/>
-          <w:lang w:val="es-DO"/>
-        </w:rPr>
-        <w:t>Instituto Tecnológico de las Américas (ITLA)</w:t>
-      </w:r>
-    </w:p>
-    <w:p>
-      <w:pPr>
-        <w:spacing w:after="100" w:line="240" w:lineRule="auto"/>
-        <w:ind w:left="-432" w:right="144"/>
-        <w:rPr>
-          <w:rFonts w:ascii="Roboto" w:hAnsi="Roboto"/>
-          <w:b/>
-          <w:bCs/>
-          <w:sz w:val="18"/>
-          <w:szCs w:val="18"/>
-          <w:lang w:val="en-US"/>
-        </w:rPr>
-      </w:pPr>
-      <w:r>
-        <w:rPr>
-          <w:rFonts w:ascii="Roboto" w:hAnsi="Roboto"/>
-          <w:color w:val="404040" w:themeColor="text1" w:themeTint="BF"/>
-          <w:sz w:val="18"/>
-          <w:szCs w:val="18"/>
-          <w:lang w:val="en-US"/>
-        </w:rPr>
-        <w:t>Associate Degree in Software Development</w:t>
-      </w:r>
-    </w:p>
-    <w:p>
-      <w:pPr>
-        <w:spacing w:after="100" w:line="240" w:lineRule="auto"/>
-        <w:ind w:right="144"/>
-        <w:rPr>
-          <w:rFonts w:ascii="Roboto" w:hAnsi="Roboto"/>
-          <w:color w:val="262626" w:themeColor="text1" w:themeTint="D9"/>
-          <w:sz w:val="17"/>
-          <w:szCs w:val="17"/>
-          <w:lang w:val="en-US"/>
-        </w:rPr>
-      </w:pPr>
-    </w:p>
-    <w:p>
-      <w:pPr>
-        <w:spacing w:before="240" w:after="0" w:line="288" w:lineRule="auto"/>
-        <w:ind w:left="288" w:right="-720"/>
-        <w:rPr>
-          <w:rFonts w:ascii="Roboto" w:hAnsi="Roboto"/>
-          <w:lang w:val="en-US"/>
-        </w:rPr>
-      </w:pPr>
-    </w:p>
-    <w:p>
-      <w:pPr>
-        <w:spacing w:after="0" w:line="276" w:lineRule="auto"/>
-        <w:ind w:left="288" w:right="-720"/>
-        <w:rPr>
-          <w:rStyle w:val="Hipervnculo"/>
-          <w:rFonts w:ascii="Roboto" w:hAnsi="Roboto"/>
-          <w:color w:val="404040" w:themeColor="text1" w:themeTint="BF"/>
-          <w:sz w:val="16"/>
-          <w:szCs w:val="16"/>
-          <w:u w:val="none"/>
-          <w:lang w:val="en-US"/>
-        </w:rPr>
-      </w:pPr>
-      <w:r>
-        <w:rPr>
-          <w:rStyle w:val="Hipervnculo"/>
-          <w:rFonts w:ascii="Roboto" w:hAnsi="Roboto"/>
-          <w:color w:val="404040" w:themeColor="text1" w:themeTint="BF"/>
-          <w:sz w:val="16"/>
-          <w:szCs w:val="16"/>
-          <w:u w:val="none"/>
-          <w:lang w:val="en-US"/>
-        </w:rPr>
-        <w:t>fraineralex2001@gmail.com</w:t>
-      </w:r>
-    </w:p>
-    <w:p>
-      <w:pPr>
-        <w:spacing w:after="0" w:line="276" w:lineRule="auto"/>
-        <w:ind w:left="288" w:right="-720"/>
-        <w:rPr>
-          <w:rStyle w:val="Hipervnculo"/>
-          <w:rFonts w:ascii="Roboto" w:hAnsi="Roboto"/>
-          <w:color w:val="404040" w:themeColor="text1" w:themeTint="BF"/>
-          <w:sz w:val="16"/>
-          <w:szCs w:val="16"/>
-          <w:u w:val="none"/>
-          <w:lang w:val="en-US"/>
-        </w:rPr>
-      </w:pPr>
-      <w:r>
-        <w:rPr>
-          <w:rStyle w:val="Hipervnculo"/>
-          <w:rFonts w:ascii="Roboto" w:hAnsi="Roboto"/>
-          <w:color w:val="404040" w:themeColor="text1" w:themeTint="BF"/>
-          <w:sz w:val="16"/>
-          <w:szCs w:val="16"/>
-          <w:u w:val="none"/>
-          <w:lang w:val="en-US"/>
-        </w:rPr>
-        <w:t>(809) 454–1362</w:t>
-      </w:r>
-    </w:p>
-    <w:p>
-      <w:pPr>
-        <w:spacing w:after="0" w:line="276" w:lineRule="auto"/>
-        <w:ind w:left="288" w:right="-720"/>
-        <w:rPr>
-          <w:rStyle w:val="Hipervnculo"/>
-          <w:rFonts w:ascii="Roboto" w:hAnsi="Roboto"/>
-          <w:color w:val="000000" w:themeColor="text1"/>
-          <w:sz w:val="16"/>
-          <w:szCs w:val="16"/>
-          <w:lang w:val="en-US"/>
-        </w:rPr>
-      </w:pPr>
-      <w:hyperlink r:id="rId9" w:history="1">
+      <w:hyperlink r:id="rId10" w:history="1">
         <w:r>
           <w:rPr>
             <w:rStyle w:val="Hipervnculo"/>
             <w:rFonts w:ascii="Roboto" w:hAnsi="Roboto"/>
+            <w:b/>
+            <w:bCs/>
             <w:color w:val="000000" w:themeColor="text1"/>
+            <w:sz w:val="20"/>
+            <w:szCs w:val="20"/>
+            <w:u w:val="none"/>
+            <w:lang w:val="en-US"/>
+          </w:rPr>
+          <w:t>Universidad Iberoamericana (UNIBE)</w:t>
+        </w:r>
+      </w:hyperlink>
+      <w:r>
+        <w:rPr>
+          <w:rFonts w:ascii="Roboto" w:hAnsi="Roboto"/>
+          <w:color w:val="404040" w:themeColor="text1" w:themeTint="BF"/>
+          <w:sz w:val="17"/>
+          <w:szCs w:val="17"/>
+          <w:lang w:val="en-US"/>
+        </w:rPr>
+        <w:br/>
+      </w:r>
+      <w:r>
+        <w:rPr>
+          <w:rFonts w:ascii="Roboto" w:hAnsi="Roboto"/>
+          <w:color w:val="404040" w:themeColor="text1" w:themeTint="BF"/>
+          <w:sz w:val="17"/>
+          <w:szCs w:val="17"/>
+          <w:lang w:val="en-US"/>
+        </w:rPr>
+        <w:t>B.S. in Computational Technologies Engineering</w:t>
+      </w:r>
+      <w:r>
+        <w:rPr>
+          <w:rFonts w:ascii="Roboto" w:hAnsi="Roboto"/>
+          <w:color w:val="404040" w:themeColor="text1" w:themeTint="BF"/>
+          <w:sz w:val="17"/>
+          <w:szCs w:val="17"/>
+          <w:lang w:val="en-US"/>
+        </w:rPr>
+        <w:t>, focused on Software Engineering, Distributed Systems, Databases, and Computer Networks</w:t>
+      </w:r>
+      <w:r>
+        <w:rPr>
+          <w:rFonts w:ascii="Roboto" w:hAnsi="Roboto"/>
+          <w:color w:val="404040" w:themeColor="text1" w:themeTint="BF"/>
+          <w:sz w:val="17"/>
+          <w:szCs w:val="17"/>
+          <w:lang w:val="en-US"/>
+        </w:rPr>
+        <w:t>.</w:t>
+      </w:r>
+    </w:p>
+    <w:p>
+      <w:pPr>
+        <w:spacing w:before="240" w:after="0" w:line="240" w:lineRule="auto"/>
+        <w:ind w:left="-432" w:right="144"/>
+        <w:rPr>
+          <w:rFonts w:ascii="Roboto" w:hAnsi="Roboto"/>
+          <w:b/>
+          <w:bCs/>
+          <w:color w:val="000000" w:themeColor="text1"/>
+          <w:sz w:val="20"/>
+          <w:szCs w:val="20"/>
+          <w:lang w:val="es-DO"/>
+        </w:rPr>
+      </w:pPr>
+      <w:hyperlink r:id="rId11" w:history="1">
+        <w:r>
+          <w:rPr>
+            <w:rStyle w:val="Hipervnculo"/>
+            <w:rFonts w:ascii="Roboto" w:hAnsi="Roboto"/>
+            <w:b/>
+            <w:bCs/>
+            <w:color w:val="000000" w:themeColor="text1"/>
+            <w:sz w:val="20"/>
+            <w:szCs w:val="20"/>
+            <w:u w:val="none"/>
+            <w:lang w:val="es-DO"/>
+          </w:rPr>
+          <w:t>Instituto Tecnológico de las Américas (ITLA)</w:t>
+        </w:r>
+      </w:hyperlink>
+    </w:p>
+    <w:p>
+      <w:pPr>
+        <w:spacing w:after="100" w:line="240" w:lineRule="auto"/>
+        <w:ind w:left="-432" w:right="144"/>
+        <w:rPr>
+          <w:rFonts w:ascii="Roboto" w:hAnsi="Roboto"/>
+          <w:color w:val="404040" w:themeColor="text1" w:themeTint="BF"/>
+          <w:sz w:val="17"/>
+          <w:szCs w:val="17"/>
+          <w:lang w:val="en-US"/>
+        </w:rPr>
+      </w:pPr>
+      <w:r>
+        <w:rPr>
+          <w:rFonts w:ascii="Roboto" w:hAnsi="Roboto"/>
+          <w:color w:val="404040" w:themeColor="text1" w:themeTint="BF"/>
+          <w:sz w:val="17"/>
+          <w:szCs w:val="17"/>
+          <w:lang w:val="en-US"/>
+        </w:rPr>
+        <w:t>Associate Degree in Software Development</w:t>
+      </w:r>
+      <w:r>
+        <w:rPr>
+          <w:rFonts w:ascii="Roboto" w:hAnsi="Roboto"/>
+          <w:color w:val="404040" w:themeColor="text1" w:themeTint="BF"/>
+          <w:sz w:val="17"/>
+          <w:szCs w:val="17"/>
+          <w:lang w:val="en-US"/>
+        </w:rPr>
+        <w:t>, focused on Full Stack Development, Mobile Applications, and Software Architecture</w:t>
+      </w:r>
+      <w:r>
+        <w:rPr>
+          <w:rFonts w:ascii="Roboto" w:hAnsi="Roboto"/>
+          <w:color w:val="404040" w:themeColor="text1" w:themeTint="BF"/>
+          <w:sz w:val="17"/>
+          <w:szCs w:val="17"/>
+          <w:lang w:val="en-US"/>
+        </w:rPr>
+        <w:t>.</w:t>
+      </w:r>
+    </w:p>
+    <w:p>
+      <w:pPr>
+        <w:spacing w:after="100" w:line="240" w:lineRule="auto"/>
+        <w:ind w:left="-432" w:right="144"/>
+        <w:rPr>
+          <w:rFonts w:ascii="Roboto" w:hAnsi="Roboto"/>
+          <w:b/>
+          <w:bCs/>
+          <w:sz w:val="17"/>
+          <w:szCs w:val="17"/>
+          <w:lang w:val="en-US"/>
+        </w:rPr>
+      </w:pPr>
+    </w:p>
+    <w:p>
+      <w:pPr>
+        <w:spacing w:after="0" w:line="276" w:lineRule="auto"/>
+        <w:ind w:left="288" w:right="-720"/>
+        <w:rPr>
+          <w:rStyle w:val="Hipervnculo"/>
+          <w:rFonts w:ascii="Roboto" w:hAnsi="Roboto"/>
+          <w:color w:val="404040" w:themeColor="text1" w:themeTint="BF"/>
+          <w:sz w:val="16"/>
+          <w:szCs w:val="16"/>
+          <w:u w:val="none"/>
+          <w:lang w:val="en-US"/>
+        </w:rPr>
+      </w:pPr>
+      <w:hyperlink r:id="rId12" w:history="1">
+        <w:r>
+          <w:rPr>
+            <w:rStyle w:val="Hipervnculo"/>
+            <w:rFonts w:ascii="Roboto" w:hAnsi="Roboto"/>
+            <w:color w:val="404040" w:themeColor="text1" w:themeTint="BF"/>
             <w:sz w:val="16"/>
             <w:szCs w:val="16"/>
+            <w:u w:val="none"/>
+            <w:lang w:val="en-US"/>
+          </w:rPr>
+          <w:t>fraineralex2001@gmail.com</w:t>
+        </w:r>
+      </w:hyperlink>
+    </w:p>
+    <w:p>
+      <w:pPr>
+        <w:spacing w:after="0" w:line="276" w:lineRule="auto"/>
+        <w:ind w:left="288" w:right="-720"/>
+        <w:rPr>
+          <w:rStyle w:val="Hipervnculo"/>
+          <w:rFonts w:ascii="Roboto" w:hAnsi="Roboto"/>
+          <w:color w:val="404040" w:themeColor="text1" w:themeTint="BF"/>
+          <w:sz w:val="16"/>
+          <w:szCs w:val="16"/>
+          <w:u w:val="none"/>
+          <w:lang w:val="en-US"/>
+        </w:rPr>
+      </w:pPr>
+      <w:r>
+        <w:rPr>
+          <w:rStyle w:val="Hipervnculo"/>
+          <w:rFonts w:ascii="Roboto" w:hAnsi="Roboto"/>
+          <w:color w:val="404040" w:themeColor="text1" w:themeTint="BF"/>
+          <w:sz w:val="16"/>
+          <w:szCs w:val="16"/>
+          <w:u w:val="none"/>
+          <w:lang w:val="en-US"/>
+        </w:rPr>
+        <w:fldChar w:fldCharType="begin"/>
+      </w:r>
+      <w:r>
+        <w:rPr>
+          <w:rStyle w:val="Hipervnculo"/>
+          <w:rFonts w:ascii="Roboto" w:hAnsi="Roboto"/>
+          <w:color w:val="404040" w:themeColor="text1" w:themeTint="BF"/>
+          <w:sz w:val="16"/>
+          <w:szCs w:val="16"/>
+          <w:u w:val="none"/>
+          <w:lang w:val="en-US"/>
+        </w:rPr>
+        <w:instrText>HYPERLINK "tel:+1809-454–1362" \o "+1 (809) 454-1362"</w:instrText>
+      </w:r>
+      <w:r>
+        <w:rPr>
+          <w:rStyle w:val="Hipervnculo"/>
+          <w:rFonts w:ascii="Roboto" w:hAnsi="Roboto"/>
+          <w:color w:val="404040" w:themeColor="text1" w:themeTint="BF"/>
+          <w:sz w:val="16"/>
+          <w:szCs w:val="16"/>
+          <w:u w:val="none"/>
+          <w:lang w:val="en-US"/>
+        </w:rPr>
+      </w:r>
+      <w:r>
+        <w:rPr>
+          <w:rStyle w:val="Hipervnculo"/>
+          <w:rFonts w:ascii="Roboto" w:hAnsi="Roboto"/>
+          <w:color w:val="404040" w:themeColor="text1" w:themeTint="BF"/>
+          <w:sz w:val="16"/>
+          <w:szCs w:val="16"/>
+          <w:u w:val="none"/>
+          <w:lang w:val="en-US"/>
+        </w:rPr>
+        <w:fldChar w:fldCharType="separate"/>
+      </w:r>
+      <w:r>
+        <w:rPr>
+          <w:rStyle w:val="Hipervnculo"/>
+          <w:rFonts w:ascii="Roboto" w:hAnsi="Roboto"/>
+          <w:color w:val="404040" w:themeColor="text1" w:themeTint="BF"/>
+          <w:sz w:val="16"/>
+          <w:szCs w:val="16"/>
+          <w:u w:val="none"/>
+          <w:lang w:val="en-US"/>
+        </w:rPr>
+        <w:t>+1 (</w:t>
+      </w:r>
+      <w:r>
+        <w:rPr>
+          <w:rStyle w:val="Hipervnculo"/>
+          <w:rFonts w:ascii="Roboto" w:hAnsi="Roboto"/>
+          <w:color w:val="404040" w:themeColor="text1" w:themeTint="BF"/>
+          <w:sz w:val="16"/>
+          <w:szCs w:val="16"/>
+          <w:u w:val="none"/>
+          <w:lang w:val="en-US"/>
+        </w:rPr>
+        <w:t>809) 454–1362</w:t>
+      </w:r>
+    </w:p>
+    <w:p>
+      <w:pPr>
+        <w:spacing w:after="0" w:line="276" w:lineRule="auto"/>
+        <w:ind w:left="288" w:right="-720"/>
+        <w:rPr>
+          <w:rStyle w:val="Hipervnculo"/>
+          <w:rFonts w:ascii="Roboto" w:hAnsi="Roboto"/>
+          <w:color w:val="404040" w:themeColor="text1" w:themeTint="BF"/>
+          <w:sz w:val="16"/>
+          <w:szCs w:val="16"/>
+          <w:u w:val="none"/>
+          <w:lang w:val="en-US"/>
+        </w:rPr>
+      </w:pPr>
+      <w:r>
+        <w:rPr>
+          <w:rStyle w:val="Hipervnculo"/>
+          <w:rFonts w:ascii="Roboto" w:hAnsi="Roboto"/>
+          <w:color w:val="404040" w:themeColor="text1" w:themeTint="BF"/>
+          <w:sz w:val="16"/>
+          <w:szCs w:val="16"/>
+          <w:u w:val="none"/>
+          <w:lang w:val="en-US"/>
+        </w:rPr>
+        <w:fldChar w:fldCharType="end"/>
+      </w:r>
+      <w:hyperlink r:id="rId13" w:history="1">
+        <w:r>
+          <w:rPr>
+            <w:rStyle w:val="Hipervnculo"/>
+            <w:rFonts w:ascii="Roboto" w:hAnsi="Roboto"/>
+            <w:color w:val="404040" w:themeColor="text1" w:themeTint="BF"/>
+            <w:sz w:val="16"/>
+            <w:szCs w:val="16"/>
+            <w:u w:val="none"/>
             <w:lang w:val="en-US"/>
           </w:rPr>
           <w:t>github.com/</w:t>
@@ -1542,9 +1619,10 @@
           <w:rPr>
             <w:rStyle w:val="Hipervnculo"/>
             <w:rFonts w:ascii="Roboto" w:hAnsi="Roboto"/>
-            <w:color w:val="000000" w:themeColor="text1"/>
+            <w:color w:val="404040" w:themeColor="text1" w:themeTint="BF"/>
             <w:sz w:val="16"/>
             <w:szCs w:val="16"/>
+            <w:u w:val="none"/>
             <w:lang w:val="en-US"/>
           </w:rPr>
           <w:t>fraineralex</w:t>
@@ -1559,20 +1637,22 @@
         <w:rPr>
           <w:rStyle w:val="Hipervnculo"/>
           <w:rFonts w:ascii="Roboto" w:hAnsi="Roboto"/>
-          <w:color w:val="000000" w:themeColor="text1"/>
-          <w:sz w:val="16"/>
-          <w:szCs w:val="16"/>
-          <w:lang w:val="en-US"/>
-        </w:rPr>
-      </w:pPr>
-      <w:hyperlink r:id="rId10" w:history="1">
+          <w:color w:val="404040" w:themeColor="text1" w:themeTint="BF"/>
+          <w:sz w:val="16"/>
+          <w:szCs w:val="16"/>
+          <w:u w:val="none"/>
+          <w:lang w:val="en-US"/>
+        </w:rPr>
+      </w:pPr>
+      <w:hyperlink r:id="rId14" w:history="1">
         <w:r>
           <w:rPr>
             <w:rStyle w:val="Hipervnculo"/>
             <w:rFonts w:ascii="Roboto" w:hAnsi="Roboto"/>
-            <w:color w:val="000000" w:themeColor="text1"/>
+            <w:color w:val="404040" w:themeColor="text1" w:themeTint="BF"/>
             <w:sz w:val="16"/>
             <w:szCs w:val="16"/>
+            <w:u w:val="none"/>
             <w:lang w:val="en-US"/>
           </w:rPr>
           <w:t>linkedin.com/in/fraineralex</w:t>
@@ -1583,23 +1663,17 @@
       <w:pPr>
         <w:spacing w:after="0" w:line="276" w:lineRule="auto"/>
         <w:ind w:left="288" w:right="-720"/>
-        <w:rPr>
-          <w:rFonts w:ascii="Roboto" w:hAnsi="Roboto"/>
-          <w:color w:val="000000" w:themeColor="text1"/>
-          <w:sz w:val="16"/>
-          <w:szCs w:val="16"/>
-          <w:lang w:val="en-US"/>
-        </w:rPr>
-      </w:pPr>
-      <w:hyperlink r:id="rId11" w:history="1">
+      </w:pPr>
+      <w:hyperlink r:id="rId15" w:history="1">
         <w:proofErr w:type="spellStart"/>
         <w:r>
           <w:rPr>
             <w:rStyle w:val="Hipervnculo"/>
             <w:rFonts w:ascii="Roboto" w:hAnsi="Roboto"/>
-            <w:color w:val="000000" w:themeColor="text1"/>
+            <w:color w:val="404040" w:themeColor="text1" w:themeTint="BF"/>
             <w:sz w:val="16"/>
             <w:szCs w:val="16"/>
+            <w:u w:val="none"/>
             <w:lang w:val="en-US"/>
           </w:rPr>
           <w:t>fraineralex.dev</w:t>
@@ -1609,6 +1683,19 @@
     </w:p>
     <w:p>
       <w:pPr>
+        <w:spacing w:after="0" w:line="276" w:lineRule="auto"/>
+        <w:ind w:left="288" w:right="-720"/>
+        <w:rPr>
+          <w:rFonts w:ascii="Roboto" w:hAnsi="Roboto"/>
+          <w:color w:val="404040" w:themeColor="text1" w:themeTint="BF"/>
+          <w:sz w:val="16"/>
+          <w:szCs w:val="16"/>
+          <w:lang w:val="en-US"/>
+        </w:rPr>
+      </w:pPr>
+    </w:p>
+    <w:p>
+      <w:pPr>
         <w:spacing w:after="0" w:line="288" w:lineRule="auto"/>
         <w:ind w:left="288" w:right="-720"/>
         <w:rPr>
@@ -1670,115 +1757,143 @@
     </w:p>
     <w:p>
       <w:pPr>
+        <w:spacing w:line="288" w:lineRule="auto"/>
+        <w:ind w:left="288" w:right="-720"/>
+        <w:rPr>
+          <w:rFonts w:ascii="Roboto" w:hAnsi="Roboto"/>
+          <w:color w:val="404040" w:themeColor="text1" w:themeTint="BF"/>
+          <w:sz w:val="16"/>
+          <w:szCs w:val="16"/>
+          <w:lang w:val="en-US"/>
+        </w:rPr>
+      </w:pPr>
+      <w:r>
+        <w:rPr>
+          <w:rFonts w:ascii="Roboto" w:hAnsi="Roboto"/>
+          <w:color w:val="404040" w:themeColor="text1" w:themeTint="BF"/>
+          <w:sz w:val="16"/>
+          <w:szCs w:val="16"/>
+          <w:lang w:val="en-US"/>
+        </w:rPr>
+        <w:t>TypeScript</w:t>
+      </w:r>
+      <w:r>
+        <w:rPr>
+          <w:rFonts w:ascii="Roboto" w:hAnsi="Roboto"/>
+          <w:color w:val="404040" w:themeColor="text1" w:themeTint="BF"/>
+          <w:sz w:val="16"/>
+          <w:szCs w:val="16"/>
+          <w:lang w:val="en-US"/>
+        </w:rPr>
+        <w:t xml:space="preserve">, </w:t>
+      </w:r>
+      <w:r>
+        <w:rPr>
+          <w:rFonts w:ascii="Roboto" w:hAnsi="Roboto"/>
+          <w:color w:val="404040" w:themeColor="text1" w:themeTint="BF"/>
+          <w:sz w:val="16"/>
+          <w:szCs w:val="16"/>
+          <w:lang w:val="en-US"/>
+        </w:rPr>
+        <w:t xml:space="preserve">JavaScript, Python, C#, </w:t>
+      </w:r>
+      <w:r>
+        <w:rPr>
+          <w:rFonts w:ascii="Roboto" w:hAnsi="Roboto"/>
+          <w:color w:val="404040" w:themeColor="text1" w:themeTint="BF"/>
+          <w:sz w:val="16"/>
+          <w:szCs w:val="16"/>
+          <w:lang w:val="en-US"/>
+        </w:rPr>
+        <w:t>SQ</w:t>
+      </w:r>
+      <w:r>
+        <w:rPr>
+          <w:rFonts w:ascii="Roboto" w:hAnsi="Roboto"/>
+          <w:color w:val="404040" w:themeColor="text1" w:themeTint="BF"/>
+          <w:sz w:val="16"/>
+          <w:szCs w:val="16"/>
+          <w:lang w:val="en-US"/>
+        </w:rPr>
+        <w:t>L.</w:t>
+      </w:r>
+    </w:p>
+    <w:p>
+      <w:pPr>
         <w:spacing w:after="0" w:line="288" w:lineRule="auto"/>
         <w:ind w:left="288" w:right="-720"/>
         <w:rPr>
           <w:rFonts w:ascii="Roboto" w:hAnsi="Roboto"/>
-          <w:color w:val="404040" w:themeColor="text1" w:themeTint="BF"/>
-          <w:sz w:val="16"/>
-          <w:szCs w:val="16"/>
-          <w:lang w:val="en-US"/>
-        </w:rPr>
-      </w:pPr>
-      <w:r>
-        <w:rPr>
-          <w:rFonts w:ascii="Roboto" w:hAnsi="Roboto"/>
-          <w:color w:val="404040" w:themeColor="text1" w:themeTint="BF"/>
-          <w:sz w:val="16"/>
-          <w:szCs w:val="16"/>
-          <w:lang w:val="en-US"/>
-        </w:rPr>
-        <w:t>TypeScript</w:t>
-      </w:r>
-      <w:r>
-        <w:rPr>
-          <w:rFonts w:ascii="Roboto" w:hAnsi="Roboto"/>
-          <w:color w:val="404040" w:themeColor="text1" w:themeTint="BF"/>
-          <w:sz w:val="16"/>
-          <w:szCs w:val="16"/>
-          <w:lang w:val="en-US"/>
-        </w:rPr>
-        <w:t xml:space="preserve">, </w:t>
-      </w:r>
-      <w:r>
-        <w:rPr>
-          <w:rFonts w:ascii="Roboto" w:hAnsi="Roboto"/>
-          <w:color w:val="404040" w:themeColor="text1" w:themeTint="BF"/>
-          <w:sz w:val="16"/>
-          <w:szCs w:val="16"/>
-          <w:lang w:val="en-US"/>
-        </w:rPr>
-        <w:t>JavaScript</w:t>
-      </w:r>
-      <w:r>
-        <w:rPr>
-          <w:rFonts w:ascii="Roboto" w:hAnsi="Roboto"/>
-          <w:color w:val="404040" w:themeColor="text1" w:themeTint="BF"/>
-          <w:sz w:val="16"/>
-          <w:szCs w:val="16"/>
-          <w:lang w:val="en-US"/>
-        </w:rPr>
-        <w:t xml:space="preserve">, </w:t>
-      </w:r>
-      <w:r>
-        <w:rPr>
-          <w:rFonts w:ascii="Roboto" w:hAnsi="Roboto"/>
-          <w:color w:val="404040" w:themeColor="text1" w:themeTint="BF"/>
-          <w:sz w:val="16"/>
-          <w:szCs w:val="16"/>
-          <w:lang w:val="en-US"/>
-        </w:rPr>
-        <w:t>Python</w:t>
-      </w:r>
-      <w:r>
-        <w:rPr>
-          <w:rFonts w:ascii="Roboto" w:hAnsi="Roboto"/>
-          <w:color w:val="404040" w:themeColor="text1" w:themeTint="BF"/>
-          <w:sz w:val="16"/>
-          <w:szCs w:val="16"/>
-          <w:lang w:val="en-US"/>
-        </w:rPr>
-        <w:t xml:space="preserve">, </w:t>
-      </w:r>
-      <w:r>
-        <w:rPr>
-          <w:rFonts w:ascii="Roboto" w:hAnsi="Roboto"/>
-          <w:color w:val="404040" w:themeColor="text1" w:themeTint="BF"/>
-          <w:sz w:val="16"/>
-          <w:szCs w:val="16"/>
-          <w:lang w:val="en-US"/>
-        </w:rPr>
-        <w:t>C#</w:t>
-      </w:r>
-      <w:r>
-        <w:rPr>
-          <w:rFonts w:ascii="Roboto" w:hAnsi="Roboto"/>
-          <w:color w:val="404040" w:themeColor="text1" w:themeTint="BF"/>
-          <w:sz w:val="16"/>
-          <w:szCs w:val="16"/>
-          <w:lang w:val="en-US"/>
-        </w:rPr>
-        <w:t xml:space="preserve">, </w:t>
-      </w:r>
-      <w:r>
-        <w:rPr>
-          <w:rFonts w:ascii="Roboto" w:hAnsi="Roboto"/>
-          <w:color w:val="404040" w:themeColor="text1" w:themeTint="BF"/>
-          <w:sz w:val="16"/>
-          <w:szCs w:val="16"/>
-          <w:lang w:val="en-US"/>
-        </w:rPr>
-        <w:t>SQ</w:t>
-      </w:r>
-      <w:r>
-        <w:rPr>
-          <w:rFonts w:ascii="Roboto" w:hAnsi="Roboto"/>
-          <w:color w:val="404040" w:themeColor="text1" w:themeTint="BF"/>
-          <w:sz w:val="16"/>
-          <w:szCs w:val="16"/>
-          <w:lang w:val="en-US"/>
-        </w:rPr>
-        <w:t>L.</w:t>
+          <w:b/>
+          <w:bCs/>
+          <w:sz w:val="18"/>
+          <w:szCs w:val="18"/>
+          <w:lang w:val="en-US"/>
+        </w:rPr>
+      </w:pPr>
+      <w:r>
+        <w:rPr>
+          <w:rFonts w:ascii="Roboto" w:hAnsi="Roboto"/>
+          <w:b/>
+          <w:bCs/>
+          <w:sz w:val="18"/>
+          <w:szCs w:val="18"/>
+          <w:lang w:val="en-US"/>
+        </w:rPr>
+        <w:t>Frontend</w:t>
+      </w:r>
+    </w:p>
+    <w:p>
+      <w:pPr>
+        <w:spacing w:line="288" w:lineRule="auto"/>
+        <w:ind w:left="288" w:right="-720"/>
+        <w:rPr>
+          <w:rFonts w:ascii="Roboto" w:hAnsi="Roboto"/>
+          <w:color w:val="404040" w:themeColor="text1" w:themeTint="BF"/>
+          <w:sz w:val="16"/>
+          <w:szCs w:val="16"/>
+          <w:lang w:val="en-US"/>
+        </w:rPr>
+      </w:pPr>
+      <w:r>
+        <w:rPr>
+          <w:rFonts w:ascii="Roboto" w:hAnsi="Roboto"/>
+          <w:color w:val="404040" w:themeColor="text1" w:themeTint="BF"/>
+          <w:sz w:val="16"/>
+          <w:szCs w:val="16"/>
+          <w:lang w:val="en-US"/>
+        </w:rPr>
+        <w:t xml:space="preserve">React, Next.js, React Native, </w:t>
+      </w:r>
+      <w:r>
+        <w:rPr>
+          <w:rFonts w:ascii="Roboto" w:hAnsi="Roboto"/>
+          <w:color w:val="404040" w:themeColor="text1" w:themeTint="BF"/>
+          <w:sz w:val="16"/>
+          <w:szCs w:val="16"/>
+          <w:lang w:val="en-US"/>
+        </w:rPr>
+        <w:t xml:space="preserve">HTML, CSS, </w:t>
+      </w:r>
+      <w:r>
+        <w:rPr>
+          <w:rFonts w:ascii="Roboto" w:hAnsi="Roboto"/>
+          <w:color w:val="404040" w:themeColor="text1" w:themeTint="BF"/>
+          <w:sz w:val="16"/>
+          <w:szCs w:val="16"/>
+          <w:lang w:val="en-US"/>
+        </w:rPr>
+        <w:t>Tailwind</w:t>
+      </w:r>
+      <w:r>
+        <w:rPr>
+          <w:rFonts w:ascii="Roboto" w:hAnsi="Roboto"/>
+          <w:color w:val="404040" w:themeColor="text1" w:themeTint="BF"/>
+          <w:sz w:val="16"/>
+          <w:szCs w:val="16"/>
+          <w:lang w:val="en-US"/>
+        </w:rPr>
+        <w:t>.</w:t>
       </w:r>
     </w:p>
     <w:p>
@@ -1787,11 +1902,67 @@
         <w:ind w:left="288" w:right="-720"/>
         <w:rPr>
           <w:rFonts w:ascii="Roboto" w:hAnsi="Roboto"/>
+          <w:b/>
+          <w:bCs/>
           <w:sz w:val="18"/>
           <w:szCs w:val="18"/>
           <w:lang w:val="en-US"/>
         </w:rPr>
       </w:pPr>
+      <w:r>
+        <w:rPr>
+          <w:rFonts w:ascii="Roboto" w:hAnsi="Roboto"/>
+          <w:b/>
+          <w:bCs/>
+          <w:sz w:val="18"/>
+          <w:szCs w:val="18"/>
+          <w:lang w:val="en-US"/>
+        </w:rPr>
+        <w:t>Backend</w:t>
+      </w:r>
+    </w:p>
+    <w:p>
+      <w:pPr>
+        <w:spacing w:line="288" w:lineRule="auto"/>
+        <w:ind w:left="288" w:right="-720"/>
+        <w:rPr>
+          <w:rFonts w:ascii="Roboto" w:hAnsi="Roboto"/>
+          <w:color w:val="404040" w:themeColor="text1" w:themeTint="BF"/>
+          <w:sz w:val="16"/>
+          <w:szCs w:val="16"/>
+          <w:lang w:val="en-US"/>
+        </w:rPr>
+      </w:pPr>
+      <w:r>
+        <w:rPr>
+          <w:rFonts w:ascii="Roboto" w:hAnsi="Roboto"/>
+          <w:color w:val="404040" w:themeColor="text1" w:themeTint="BF"/>
+          <w:sz w:val="16"/>
+          <w:szCs w:val="16"/>
+          <w:lang w:val="en-US"/>
+        </w:rPr>
+        <w:t>Node.js, Express</w:t>
+      </w:r>
+      <w:r>
+        <w:rPr>
+          <w:rFonts w:ascii="Roboto" w:hAnsi="Roboto"/>
+          <w:color w:val="404040" w:themeColor="text1" w:themeTint="BF"/>
+          <w:sz w:val="16"/>
+          <w:szCs w:val="16"/>
+          <w:lang w:val="en-US"/>
+        </w:rPr>
+        <w:t xml:space="preserve">, </w:t>
+      </w:r>
+      <w:r>
+        <w:rPr>
+          <w:rFonts w:ascii="Roboto" w:hAnsi="Roboto"/>
+          <w:color w:val="404040" w:themeColor="text1" w:themeTint="BF"/>
+          <w:sz w:val="16"/>
+          <w:szCs w:val="16"/>
+          <w:lang w:val="en-US"/>
+        </w:rPr>
+        <w:t>ASP.NET, Odoo.</w:t>
+      </w:r>
     </w:p>
     <w:p>
       <w:pPr>
@@ -1815,7 +1986,7 @@
           <w:szCs w:val="18"/>
           <w:lang w:val="en-US"/>
         </w:rPr>
-        <w:t>Frontend</w:t>
+        <w:t>Cloud, Infrastructure &amp; Databases</w:t>
       </w:r>
     </w:p>
     <w:p>
@@ -1838,37 +2009,7 @@
           <w:szCs w:val="16"/>
           <w:lang w:val="en-US"/>
         </w:rPr>
-        <w:t xml:space="preserve">React, Next.js, React Native, </w:t>
-      </w:r>
-      <w:r>
-        <w:rPr>
-          <w:rFonts w:ascii="Roboto" w:hAnsi="Roboto"/>
-          <w:color w:val="404040" w:themeColor="text1" w:themeTint="BF"/>
-          <w:sz w:val="16"/>
-          <w:szCs w:val="16"/>
-          <w:lang w:val="en-US"/>
-        </w:rPr>
-        <w:t xml:space="preserve">HTML, CSS, </w:t>
-      </w:r>
-      <w:r>
-        <w:rPr>
-          <w:rFonts w:ascii="Roboto" w:hAnsi="Roboto"/>
-          <w:color w:val="404040" w:themeColor="text1" w:themeTint="BF"/>
-          <w:sz w:val="16"/>
-          <w:szCs w:val="16"/>
-          <w:lang w:val="en-US"/>
-        </w:rPr>
-        <w:t>Tailwind</w:t>
-      </w:r>
-      <w:r>
-        <w:rPr>
-          <w:rFonts w:ascii="Roboto" w:hAnsi="Roboto"/>
-          <w:color w:val="404040" w:themeColor="text1" w:themeTint="BF"/>
-          <w:sz w:val="16"/>
-          <w:szCs w:val="16"/>
-          <w:lang w:val="en-US"/>
-        </w:rPr>
-        <w:t>.</w:t>
+        <w:t>AWS, Cloudflare, Docker, Kubernetes, Terraform, PostgreSQL, SQL Server, MongoDB, Redis.</w:t>
       </w:r>
     </w:p>
     <w:p>
@@ -1877,6 +2018,20 @@
         <w:ind w:left="288" w:right="-720"/>
         <w:rPr>
           <w:rFonts w:ascii="Roboto" w:hAnsi="Roboto"/>
+          <w:color w:val="404040" w:themeColor="text1" w:themeTint="BF"/>
+          <w:sz w:val="16"/>
+          <w:szCs w:val="16"/>
+          <w:lang w:val="en-US"/>
+        </w:rPr>
+      </w:pPr>
+    </w:p>
+    <w:p>
+      <w:pPr>
+        <w:spacing w:after="0" w:line="288" w:lineRule="auto"/>
+        <w:ind w:left="288" w:right="-720"/>
+        <w:rPr>
+          <w:rFonts w:ascii="Roboto" w:hAnsi="Roboto"/>
+          <w:color w:val="404040" w:themeColor="text1" w:themeTint="BF"/>
           <w:sz w:val="18"/>
           <w:szCs w:val="18"/>
           <w:lang w:val="en-US"/>
@@ -1885,6 +2040,29 @@
     </w:p>
     <w:p>
       <w:pPr>
+        <w:spacing w:line="276" w:lineRule="auto"/>
+        <w:ind w:left="288" w:right="-720"/>
+        <w:rPr>
+          <w:rFonts w:ascii="Roboto" w:hAnsi="Roboto"/>
+          <w:b/>
+          <w:bCs/>
+          <w:color w:val="194CE5"/>
+          <w:lang w:val="en-US"/>
+        </w:rPr>
+      </w:pPr>
+      <w:r>
+        <w:rPr>
+          <w:rFonts w:ascii="Roboto" w:hAnsi="Roboto"/>
+          <w:b/>
+          <w:bCs/>
+          <w:color w:val="194CE5"/>
+          <w:lang w:val="en-US"/>
+        </w:rPr>
+        <w:t>Selected Projects</w:t>
+      </w:r>
+    </w:p>
+    <w:p>
+      <w:pPr>
         <w:spacing w:after="0" w:line="288" w:lineRule="auto"/>
         <w:ind w:left="288" w:right="-720"/>
         <w:rPr>
@@ -1896,253 +2074,46 @@
           <w:lang w:val="en-US"/>
         </w:rPr>
       </w:pPr>
-      <w:r>
-        <w:rPr>
-          <w:rFonts w:ascii="Roboto" w:hAnsi="Roboto"/>
-          <w:b/>
-          <w:bCs/>
+      <w:hyperlink r:id="rId16" w:history="1">
+        <w:r>
+          <w:rPr>
+            <w:rStyle w:val="Hipervnculo"/>
+            <w:rFonts w:ascii="Roboto" w:hAnsi="Roboto"/>
+            <w:b/>
+            <w:bCs/>
+            <w:color w:val="000000" w:themeColor="text1"/>
+            <w:sz w:val="18"/>
+            <w:szCs w:val="18"/>
+            <w:u w:val="none"/>
+            <w:lang w:val="en-US"/>
+          </w:rPr>
+          <w:t>Viollet</w:t>
+        </w:r>
+      </w:hyperlink>
+      <w:r>
+        <w:rPr>
+          <w:rFonts w:ascii="Roboto" w:hAnsi="Roboto"/>
+          <w:b/>
+          <w:bCs/>
+          <w:color w:val="000000" w:themeColor="text1"/>
           <w:sz w:val="18"/>
           <w:szCs w:val="18"/>
           <w:lang w:val="en-US"/>
         </w:rPr>
-        <w:t>Backend</w:t>
-      </w:r>
-    </w:p>
-    <w:p>
-      <w:pPr>
-        <w:spacing w:after="0" w:line="288" w:lineRule="auto"/>
-        <w:ind w:left="288" w:right="-720"/>
-        <w:rPr>
-          <w:rFonts w:ascii="Roboto" w:hAnsi="Roboto"/>
-          <w:color w:val="404040" w:themeColor="text1" w:themeTint="BF"/>
-          <w:sz w:val="16"/>
-          <w:szCs w:val="16"/>
-          <w:lang w:val="en-US"/>
-        </w:rPr>
-      </w:pPr>
-      <w:r>
-        <w:rPr>
-          <w:rFonts w:ascii="Roboto" w:hAnsi="Roboto"/>
-          <w:color w:val="404040" w:themeColor="text1" w:themeTint="BF"/>
-          <w:sz w:val="16"/>
-          <w:szCs w:val="16"/>
-          <w:lang w:val="en-US"/>
-        </w:rPr>
-        <w:t>Node.js</w:t>
-      </w:r>
-      <w:r>
-        <w:rPr>
-          <w:rFonts w:ascii="Roboto" w:hAnsi="Roboto"/>
-          <w:color w:val="404040" w:themeColor="text1" w:themeTint="BF"/>
-          <w:sz w:val="16"/>
-          <w:szCs w:val="16"/>
-          <w:lang w:val="en-US"/>
-        </w:rPr>
-        <w:t xml:space="preserve">, </w:t>
-      </w:r>
-      <w:r>
-        <w:rPr>
-          <w:rFonts w:ascii="Roboto" w:hAnsi="Roboto"/>
-          <w:color w:val="404040" w:themeColor="text1" w:themeTint="BF"/>
-          <w:sz w:val="16"/>
-          <w:szCs w:val="16"/>
-          <w:lang w:val="en-US"/>
-        </w:rPr>
-        <w:t>Express</w:t>
-      </w:r>
-      <w:r>
-        <w:rPr>
-          <w:rFonts w:ascii="Roboto" w:hAnsi="Roboto"/>
-          <w:color w:val="404040" w:themeColor="text1" w:themeTint="BF"/>
-          <w:sz w:val="16"/>
-          <w:szCs w:val="16"/>
-          <w:lang w:val="en-US"/>
-        </w:rPr>
-        <w:t xml:space="preserve">, </w:t>
-      </w:r>
-      <w:r>
-        <w:rPr>
-          <w:rFonts w:ascii="Roboto" w:hAnsi="Roboto"/>
-          <w:color w:val="404040" w:themeColor="text1" w:themeTint="BF"/>
-          <w:sz w:val="16"/>
-          <w:szCs w:val="16"/>
-          <w:lang w:val="en-US"/>
-        </w:rPr>
-        <w:t>ASP.NET</w:t>
-      </w:r>
-      <w:r>
-        <w:rPr>
-          <w:rFonts w:ascii="Roboto" w:hAnsi="Roboto"/>
-          <w:color w:val="404040" w:themeColor="text1" w:themeTint="BF"/>
-          <w:sz w:val="16"/>
-          <w:szCs w:val="16"/>
-          <w:lang w:val="en-US"/>
-        </w:rPr>
-        <w:t xml:space="preserve">, </w:t>
-      </w:r>
-      <w:r>
-        <w:rPr>
-          <w:rFonts w:ascii="Roboto" w:hAnsi="Roboto"/>
-          <w:color w:val="404040" w:themeColor="text1" w:themeTint="BF"/>
-          <w:sz w:val="16"/>
-          <w:szCs w:val="16"/>
-          <w:lang w:val="en-US"/>
-        </w:rPr>
-        <w:t>Odoo</w:t>
-      </w:r>
-      <w:r>
-        <w:rPr>
-          <w:rFonts w:ascii="Roboto" w:hAnsi="Roboto"/>
-          <w:color w:val="404040" w:themeColor="text1" w:themeTint="BF"/>
-          <w:sz w:val="16"/>
-          <w:szCs w:val="16"/>
-          <w:lang w:val="en-US"/>
-        </w:rPr>
-        <w:t>.</w:t>
-      </w:r>
-    </w:p>
-    <w:p>
-      <w:pPr>
-        <w:spacing w:after="0" w:line="288" w:lineRule="auto"/>
-        <w:ind w:left="288" w:right="-720"/>
-        <w:rPr>
-          <w:rFonts w:ascii="Roboto" w:hAnsi="Roboto"/>
+        <w:t xml:space="preserve"> </w:t>
+      </w:r>
+      <w:r>
+        <w:rPr>
+          <w:rFonts w:ascii="Roboto" w:hAnsi="Roboto"/>
+          <w:b/>
+          <w:bCs/>
           <w:sz w:val="18"/>
           <w:szCs w:val="18"/>
           <w:lang w:val="en-US"/>
         </w:rPr>
-      </w:pPr>
-    </w:p>
-    <w:p>
-      <w:pPr>
-        <w:spacing w:after="0" w:line="288" w:lineRule="auto"/>
-        <w:ind w:left="288" w:right="-720"/>
-        <w:rPr>
-          <w:rFonts w:ascii="Roboto" w:hAnsi="Roboto"/>
-          <w:b/>
-          <w:bCs/>
-          <w:sz w:val="18"/>
-          <w:szCs w:val="18"/>
-          <w:lang w:val="en-US"/>
-        </w:rPr>
-      </w:pPr>
-      <w:r>
-        <w:rPr>
-          <w:rFonts w:ascii="Roboto" w:hAnsi="Roboto"/>
-          <w:b/>
-          <w:bCs/>
-          <w:sz w:val="18"/>
-          <w:szCs w:val="18"/>
-          <w:lang w:val="en-US"/>
-        </w:rPr>
-        <w:t>Cloud, Infrastructure &amp; Databases</w:t>
-      </w:r>
-    </w:p>
-    <w:p>
-      <w:pPr>
-        <w:spacing w:after="0" w:line="288" w:lineRule="auto"/>
-        <w:ind w:left="288" w:right="-720"/>
-        <w:rPr>
-          <w:rFonts w:ascii="Roboto" w:hAnsi="Roboto"/>
-          <w:color w:val="404040" w:themeColor="text1" w:themeTint="BF"/>
-          <w:sz w:val="16"/>
-          <w:szCs w:val="16"/>
-          <w:lang w:val="en-US"/>
-        </w:rPr>
-      </w:pPr>
-      <w:r>
-        <w:rPr>
-          <w:rFonts w:ascii="Roboto" w:hAnsi="Roboto"/>
-          <w:color w:val="404040" w:themeColor="text1" w:themeTint="BF"/>
-          <w:sz w:val="16"/>
-          <w:szCs w:val="16"/>
-          <w:lang w:val="en-US"/>
-        </w:rPr>
-        <w:t>AWS, Cloudflare, Docker, Kubernetes, Terraform, PostgreSQL, SQL Server, MongoDB, Redis</w:t>
-      </w:r>
-      <w:r>
-        <w:rPr>
-          <w:rFonts w:ascii="Roboto" w:hAnsi="Roboto"/>
-          <w:color w:val="404040" w:themeColor="text1" w:themeTint="BF"/>
-          <w:sz w:val="16"/>
-          <w:szCs w:val="16"/>
-          <w:lang w:val="en-US"/>
-        </w:rPr>
-        <w:t>.</w:t>
-      </w:r>
-    </w:p>
-    <w:p>
-      <w:pPr>
-        <w:spacing w:after="0" w:line="288" w:lineRule="auto"/>
-        <w:ind w:left="288" w:right="-720"/>
-        <w:rPr>
-          <w:rFonts w:ascii="Roboto" w:hAnsi="Roboto"/>
-          <w:color w:val="404040" w:themeColor="text1" w:themeTint="BF"/>
-          <w:sz w:val="18"/>
-          <w:szCs w:val="18"/>
-          <w:lang w:val="en-US"/>
-        </w:rPr>
-      </w:pPr>
-    </w:p>
-    <w:p>
-      <w:pPr>
-        <w:spacing w:line="276" w:lineRule="auto"/>
-        <w:ind w:left="288" w:right="-720"/>
-        <w:rPr>
-          <w:rFonts w:ascii="Roboto" w:hAnsi="Roboto"/>
-          <w:b/>
-          <w:bCs/>
-          <w:color w:val="194CE5"/>
-          <w:lang w:val="en-US"/>
-        </w:rPr>
-      </w:pPr>
-      <w:r>
-        <w:rPr>
-          <w:rFonts w:ascii="Roboto" w:hAnsi="Roboto"/>
-          <w:b/>
-          <w:bCs/>
-          <w:color w:val="194CE5"/>
-          <w:lang w:val="en-US"/>
-        </w:rPr>
-        <w:t>Selected Projects</w:t>
-      </w:r>
-    </w:p>
-    <w:p>
-      <w:pPr>
-        <w:spacing w:after="0" w:line="288" w:lineRule="auto"/>
-        <w:ind w:left="288" w:right="-720"/>
-        <w:rPr>
-          <w:rFonts w:ascii="Roboto" w:hAnsi="Roboto"/>
-          <w:b/>
-          <w:bCs/>
-          <w:sz w:val="18"/>
-          <w:szCs w:val="18"/>
-          <w:lang w:val="en-US"/>
-        </w:rPr>
-      </w:pPr>
-      <w:r>
-        <w:rPr>
-          <w:rFonts w:ascii="Roboto" w:hAnsi="Roboto"/>
-          <w:b/>
-          <w:bCs/>
-          <w:sz w:val="18"/>
-          <w:szCs w:val="18"/>
-          <w:lang w:val="en-US"/>
-        </w:rPr>
-        <w:t>Viollet</w:t>
-      </w:r>
-      <w:r>
-        <w:rPr>
-          <w:rFonts w:ascii="Roboto" w:hAnsi="Roboto"/>
-          <w:b/>
-          <w:bCs/>
-          <w:sz w:val="18"/>
-          <w:szCs w:val="18"/>
-          <w:lang w:val="en-US"/>
-        </w:rPr>
-        <w:t xml:space="preserve"> | </w:t>
-      </w:r>
-      <w:hyperlink r:id="rId12" w:history="1">
+        <w:t xml:space="preserve">| </w:t>
+      </w:r>
+      <w:hyperlink r:id="rId17" w:history="1">
         <w:proofErr w:type="spellStart"/>
         <w:r>
           <w:rPr>
@@ -2151,6 +2122,7 @@
             <w:color w:val="000000" w:themeColor="text1"/>
             <w:sz w:val="18"/>
             <w:szCs w:val="18"/>
+            <w:u w:val="none"/>
             <w:lang w:val="en-US"/>
           </w:rPr>
           <w:t>viollet.app</w:t>
@@ -2233,37 +2205,7 @@
           <w:szCs w:val="16"/>
           <w:lang w:val="en-US"/>
         </w:rPr>
-        <w:t>SQLite</w:t>
-      </w:r>
-      <w:r>
-        <w:rPr>
-          <w:rFonts w:ascii="Roboto" w:hAnsi="Roboto"/>
-          <w:color w:val="404040" w:themeColor="text1" w:themeTint="BF"/>
-          <w:sz w:val="16"/>
-          <w:szCs w:val="16"/>
-          <w:lang w:val="en-US"/>
-        </w:rPr>
-        <w:t xml:space="preserve">, Clerk, </w:t>
-      </w:r>
-      <w:r>
-        <w:rPr>
-          <w:rFonts w:ascii="Roboto" w:hAnsi="Roboto"/>
-          <w:color w:val="404040" w:themeColor="text1" w:themeTint="BF"/>
-          <w:sz w:val="16"/>
-          <w:szCs w:val="16"/>
-          <w:lang w:val="en-US"/>
-        </w:rPr>
-        <w:t xml:space="preserve">AI SDK, </w:t>
-      </w:r>
-      <w:r>
-        <w:rPr>
-          <w:rFonts w:ascii="Roboto" w:hAnsi="Roboto"/>
-          <w:color w:val="404040" w:themeColor="text1" w:themeTint="BF"/>
-          <w:sz w:val="16"/>
-          <w:szCs w:val="16"/>
-          <w:lang w:val="en-US"/>
-        </w:rPr>
-        <w:t>Gmail API, Google Pub/Sub, Webhooks</w:t>
+        <w:t>SQLite, Clerk, AI SDK, Gmail API, Google Pub/Sub, Webhooks</w:t>
       </w:r>
     </w:p>
     <w:p>
@@ -2279,19 +2221,36 @@
           <w:lang w:val="en-US"/>
         </w:rPr>
       </w:pPr>
-      <w:proofErr w:type="spellStart"/>
-      <w:r>
-        <w:rPr>
-          <w:rFonts w:ascii="Roboto" w:hAnsi="Roboto"/>
-          <w:b/>
-          <w:bCs/>
+      <w:hyperlink r:id="rId18" w:history="1">
+        <w:proofErr w:type="spellStart"/>
+        <w:r>
+          <w:rPr>
+            <w:rStyle w:val="Hipervnculo"/>
+            <w:rFonts w:ascii="Roboto" w:hAnsi="Roboto"/>
+            <w:b/>
+            <w:bCs/>
+            <w:color w:val="000000" w:themeColor="text1"/>
+            <w:sz w:val="18"/>
+            <w:szCs w:val="18"/>
+            <w:u w:val="none"/>
+            <w:lang w:val="en-US"/>
+          </w:rPr>
+          <w:t>Tracky</w:t>
+        </w:r>
+        <w:proofErr w:type="spellEnd"/>
+      </w:hyperlink>
+      <w:r>
+        <w:rPr>
+          <w:rFonts w:ascii="Roboto" w:hAnsi="Roboto"/>
+          <w:b/>
+          <w:bCs/>
+          <w:color w:val="000000" w:themeColor="text1"/>
           <w:sz w:val="18"/>
           <w:szCs w:val="18"/>
           <w:lang w:val="en-US"/>
         </w:rPr>
-        <w:t>Tracky</w:t>
-      </w:r>
-      <w:proofErr w:type="spellEnd"/>
+        <w:t xml:space="preserve"> </w:t>
+      </w:r>
       <w:r>
         <w:rPr>
           <w:rFonts w:ascii="Roboto" w:hAnsi="Roboto"/>
@@ -2301,9 +2260,9 @@
           <w:szCs w:val="18"/>
           <w:lang w:val="en-US"/>
         </w:rPr>
-        <w:t xml:space="preserve"> | </w:t>
-      </w:r>
-      <w:hyperlink r:id="rId13" w:history="1">
+        <w:t xml:space="preserve">| </w:t>
+      </w:r>
+      <w:hyperlink r:id="rId19" w:history="1">
         <w:proofErr w:type="spellStart"/>
         <w:r>
           <w:rPr>
@@ -2312,6 +2271,7 @@
             <w:color w:val="000000" w:themeColor="text1"/>
             <w:sz w:val="18"/>
             <w:szCs w:val="18"/>
+            <w:u w:val="none"/>
             <w:lang w:val="en-US"/>
           </w:rPr>
           <w:t>tracky.fit</w:t>
@@ -2443,29 +2403,47 @@
           <w:lang w:val="en-US"/>
         </w:rPr>
       </w:pPr>
-      <w:proofErr w:type="spellStart"/>
-      <w:r>
-        <w:rPr>
-          <w:rFonts w:ascii="Roboto" w:hAnsi="Roboto"/>
-          <w:b/>
-          <w:bCs/>
+      <w:hyperlink r:id="rId20" w:history="1">
+        <w:proofErr w:type="spellStart"/>
+        <w:r>
+          <w:rPr>
+            <w:rStyle w:val="Hipervnculo"/>
+            <w:rFonts w:ascii="Roboto" w:hAnsi="Roboto"/>
+            <w:b/>
+            <w:bCs/>
+            <w:color w:val="000000" w:themeColor="text1"/>
+            <w:sz w:val="18"/>
+            <w:szCs w:val="18"/>
+            <w:u w:val="none"/>
+            <w:lang w:val="en-US"/>
+          </w:rPr>
+          <w:t>Chatify</w:t>
+        </w:r>
+        <w:proofErr w:type="spellEnd"/>
+      </w:hyperlink>
+      <w:r>
+        <w:rPr>
+          <w:rFonts w:ascii="Roboto" w:hAnsi="Roboto"/>
+          <w:b/>
+          <w:bCs/>
+          <w:color w:val="000000" w:themeColor="text1"/>
           <w:sz w:val="18"/>
           <w:szCs w:val="18"/>
           <w:lang w:val="en-US"/>
         </w:rPr>
-        <w:t>Chatify</w:t>
-      </w:r>
-      <w:proofErr w:type="spellEnd"/>
-      <w:r>
-        <w:rPr>
-          <w:rFonts w:ascii="Roboto" w:hAnsi="Roboto"/>
-          <w:b/>
-          <w:bCs/>
+        <w:t xml:space="preserve"> </w:t>
+      </w:r>
+      <w:r>
+        <w:rPr>
+          <w:rFonts w:ascii="Roboto" w:hAnsi="Roboto"/>
+          <w:b/>
+          <w:bCs/>
+          <w:color w:val="404040" w:themeColor="text1" w:themeTint="BF"/>
           <w:sz w:val="18"/>
           <w:szCs w:val="18"/>
           <w:lang w:val="en-US"/>
         </w:rPr>
-        <w:t xml:space="preserve"> </w:t>
+        <w:t>|</w:t>
       </w:r>
       <w:r>
         <w:rPr>
@@ -2477,21 +2455,9 @@
           <w:szCs w:val="18"/>
           <w:lang w:val="en-US"/>
         </w:rPr>
-        <w:t>|</w:t>
-      </w:r>
-      <w:r>
-        <w:rPr>
-          <w:rFonts w:ascii="Roboto" w:hAnsi="Roboto"/>
-          <w:b/>
-          <w:bCs/>
-          <w:color w:val="404040" w:themeColor="text1" w:themeTint="BF"/>
-          <w:sz w:val="18"/>
-          <w:szCs w:val="18"/>
-          <w:lang w:val="en-US"/>
-        </w:rPr>
         <w:t xml:space="preserve"> </w:t>
       </w:r>
-      <w:hyperlink r:id="rId14" w:history="1">
+      <w:hyperlink r:id="rId21" w:history="1">
         <w:proofErr w:type="spellStart"/>
         <w:r>
           <w:rPr>
@@ -2500,6 +2466,7 @@
             <w:color w:val="000000" w:themeColor="text1"/>
             <w:sz w:val="18"/>
             <w:szCs w:val="18"/>
+            <w:u w:val="none"/>
             <w:lang w:val="en-US"/>
           </w:rPr>
           <w:t>chatify.fraineralex.dev</w:t>
@@ -2661,6 +2628,19 @@
     </w:p>
     <w:p>
       <w:pPr>
+        <w:spacing w:line="288" w:lineRule="auto"/>
+        <w:ind w:left="288" w:right="-720"/>
+        <w:rPr>
+          <w:rFonts w:ascii="Roboto" w:hAnsi="Roboto"/>
+          <w:color w:val="262626" w:themeColor="text1" w:themeTint="D9"/>
+          <w:sz w:val="16"/>
+          <w:szCs w:val="16"/>
+          <w:lang w:val="en-US"/>
+        </w:rPr>
+      </w:pPr>
+    </w:p>
+    <w:p>
+      <w:pPr>
         <w:spacing w:before="240" w:line="276" w:lineRule="auto"/>
         <w:ind w:left="288" w:right="-720"/>
         <w:rPr>
@@ -2800,7 +2780,7 @@
     </w:p>
     <w:sectPr>
       <w:pgSz w:w="12240" w:h="15840"/>
-      <w:pgMar w:top="1008" w:right="1440" w:bottom="0" w:left="1440" w:header="720" w:footer="720" w:gutter="0"/>
+      <w:pgMar w:top="720" w:right="1440" w:bottom="720" w:left="1440" w:header="720" w:footer="720" w:gutter="0"/>
       <w:cols w:num="2" w:space="0" w:equalWidth="0">
         <w:col w:w="6480" w:space="0"/>
         <w:col w:w="2880"/>
@@ -4067,4 +4047,16 @@
     </a:ext>
   </a:extLst>
 </a:theme>
+</file>
+
+<file path=customXml/item1.xml><?xml version="1.0" encoding="utf-8"?>
+<b:Sources xmlns:b="http://schemas.openxmlformats.org/officeDocument/2006/bibliography" xmlns="http://schemas.openxmlformats.org/officeDocument/2006/bibliography" SelectedStyle="\APASixthEditionOfficeOnline.xsl" StyleName="APA" Version="6"/>
+</file>
+
+<file path=customXml/itemProps1.xml><?xml version="1.0" encoding="utf-8"?>
+<ds:datastoreItem xmlns:ds="http://schemas.openxmlformats.org/officeDocument/2006/customXml" ds:itemID="{01C4892A-66D1-4D95-B4E1-99AF2AA7DE00}">
+  <ds:schemaRefs>
+    <ds:schemaRef ds:uri="http://schemas.openxmlformats.org/officeDocument/2006/bibliography"/>
+  </ds:schemaRefs>
+</ds:datastoreItem>
 </file>
</xml_diff>